<commit_message>
started steel stand and made progress with power project
</commit_message>
<xml_diff>
--- a/EEE3091/Power electronics project part b.docx
+++ b/EEE3091/Power electronics project part b.docx
@@ -75,8 +75,17 @@
           <w:b/>
           <w:bCs/>
         </w:rPr>
-        <w:t>Prepared by :</w:t>
-      </w:r>
+        <w:t xml:space="preserve">Prepared </w:t>
+      </w:r>
+      <w:proofErr w:type="gramStart"/>
+      <w:r>
+        <w:rPr>
+          <w:b/>
+          <w:bCs/>
+        </w:rPr>
+        <w:t>by :</w:t>
+      </w:r>
+      <w:proofErr w:type="gramEnd"/>
     </w:p>
     <w:p>
       <w:pPr>
@@ -112,8 +121,17 @@
           <w:b/>
           <w:bCs/>
         </w:rPr>
-        <w:t>Due Date :</w:t>
-      </w:r>
+        <w:t xml:space="preserve">Due </w:t>
+      </w:r>
+      <w:proofErr w:type="gramStart"/>
+      <w:r>
+        <w:rPr>
+          <w:b/>
+          <w:bCs/>
+        </w:rPr>
+        <w:t>Date :</w:t>
+      </w:r>
+      <w:proofErr w:type="gramEnd"/>
     </w:p>
     <w:p>
       <w:pPr>
@@ -305,6 +323,7 @@
       </w:r>
     </w:p>
     <w:p>
+      <w:proofErr w:type="gramStart"/>
       <w:r>
         <w:t>V</w:t>
       </w:r>
@@ -315,7 +334,11 @@
         <w:t xml:space="preserve">dc  </w:t>
       </w:r>
       <w:r>
-        <w:t>= 3 x 100 = 300 V</w:t>
+        <w:t>=</w:t>
+      </w:r>
+      <w:proofErr w:type="gramEnd"/>
+      <w:r>
+        <w:t xml:space="preserve"> 3 x 100 = 300 V</w:t>
       </w:r>
     </w:p>
     <w:p>
@@ -385,13 +408,7 @@
                 <w:rPr>
                   <w:rFonts w:ascii="Cambria Math" w:hAnsi="Cambria Math"/>
                 </w:rPr>
-                <m:t>1+j</m:t>
-              </m:r>
-              <m:r>
-                <w:rPr>
-                  <w:rFonts w:ascii="Cambria Math" w:hAnsi="Cambria Math"/>
-                </w:rPr>
-                <m:t>*120π*100*50×</m:t>
+                <m:t>1+j*120π*100*50×</m:t>
               </m:r>
               <m:sSup>
                 <m:sSupPr>
@@ -462,13 +479,7 @@
             <w:rPr>
               <w:rFonts w:ascii="Cambria Math" w:hAnsi="Cambria Math"/>
             </w:rPr>
-            <m:t>=</m:t>
-          </m:r>
-          <m:r>
-            <w:rPr>
-              <w:rFonts w:ascii="Cambria Math" w:hAnsi="Cambria Math"/>
-            </w:rPr>
-            <m:t>46.86∠-62.05° Ω</m:t>
+            <m:t>=46.86∠-62.05° Ω</m:t>
           </m:r>
         </m:oMath>
       </m:oMathPara>
@@ -555,13 +566,7 @@
                 <w:rPr>
                   <w:rFonts w:ascii="Cambria Math" w:eastAsiaTheme="minorEastAsia" w:hAnsi="Cambria Math"/>
                 </w:rPr>
-                <m:t>1</m:t>
-              </m:r>
-              <m:r>
-                <w:rPr>
-                  <w:rFonts w:ascii="Cambria Math" w:eastAsiaTheme="minorEastAsia" w:hAnsi="Cambria Math"/>
-                </w:rPr>
-                <m:t>rms</m:t>
+                <m:t>1rms</m:t>
               </m:r>
             </m:sub>
           </m:sSub>
@@ -901,19 +906,7 @@
                 <w:rPr>
                   <w:rFonts w:ascii="Cambria Math" w:hAnsi="Cambria Math"/>
                 </w:rPr>
-                <m:t>1+j*</m:t>
-              </m:r>
-              <m:r>
-                <w:rPr>
-                  <w:rFonts w:ascii="Cambria Math" w:hAnsi="Cambria Math"/>
-                </w:rPr>
-                <m:t>24</m:t>
-              </m:r>
-              <m:r>
-                <w:rPr>
-                  <w:rFonts w:ascii="Cambria Math" w:hAnsi="Cambria Math"/>
-                </w:rPr>
-                <m:t>0π*100*50×</m:t>
+                <m:t>1+j*240π*100*50×</m:t>
               </m:r>
               <m:sSup>
                 <m:sSupPr>
@@ -984,31 +977,7 @@
             <w:rPr>
               <w:rFonts w:ascii="Cambria Math" w:hAnsi="Cambria Math"/>
             </w:rPr>
-            <m:t>=</m:t>
-          </m:r>
-          <m:r>
-            <w:rPr>
-              <w:rFonts w:ascii="Cambria Math" w:hAnsi="Cambria Math"/>
-            </w:rPr>
-            <m:t>25.64</m:t>
-          </m:r>
-          <m:r>
-            <w:rPr>
-              <w:rFonts w:ascii="Cambria Math" w:hAnsi="Cambria Math"/>
-            </w:rPr>
-            <m:t>∠-</m:t>
-          </m:r>
-          <m:r>
-            <w:rPr>
-              <w:rFonts w:ascii="Cambria Math" w:hAnsi="Cambria Math"/>
-            </w:rPr>
-            <m:t>75.14</m:t>
-          </m:r>
-          <m:r>
-            <w:rPr>
-              <w:rFonts w:ascii="Cambria Math" w:hAnsi="Cambria Math"/>
-            </w:rPr>
-            <m:t>° Ω</m:t>
+            <m:t>=25.64∠-75.14° Ω</m:t>
           </m:r>
         </m:oMath>
       </m:oMathPara>
@@ -1253,25 +1222,7 @@
             <w:rPr>
               <w:rFonts w:ascii="Cambria Math" w:eastAsiaTheme="minorEastAsia" w:hAnsi="Cambria Math"/>
             </w:rPr>
-            <m:t>*</m:t>
-          </m:r>
-          <m:r>
-            <w:rPr>
-              <w:rFonts w:ascii="Cambria Math" w:eastAsiaTheme="minorEastAsia" w:hAnsi="Cambria Math"/>
-            </w:rPr>
-            <m:t>25.64</m:t>
-          </m:r>
-          <m:r>
-            <w:rPr>
-              <w:rFonts w:ascii="Cambria Math" w:eastAsiaTheme="minorEastAsia" w:hAnsi="Cambria Math"/>
-            </w:rPr>
-            <m:t>=1</m:t>
-          </m:r>
-          <m:r>
-            <w:rPr>
-              <w:rFonts w:ascii="Cambria Math" w:eastAsiaTheme="minorEastAsia" w:hAnsi="Cambria Math"/>
-            </w:rPr>
-            <m:t>53.84</m:t>
+            <m:t>*25.64=153.84</m:t>
           </m:r>
         </m:oMath>
       </m:oMathPara>
@@ -1332,13 +1283,7 @@
             <w:rPr>
               <w:rFonts w:ascii="Cambria Math" w:eastAsiaTheme="minorEastAsia" w:hAnsi="Cambria Math"/>
             </w:rPr>
-            <m:t>=</m:t>
-          </m:r>
-          <m:r>
-            <w:rPr>
-              <w:rFonts w:ascii="Cambria Math" w:eastAsiaTheme="minorEastAsia" w:hAnsi="Cambria Math"/>
-            </w:rPr>
-            <m:t>153.84</m:t>
+            <m:t>=153.84</m:t>
           </m:r>
           <m:func>
             <m:funcPr>
@@ -1375,19 +1320,7 @@
                     <w:rPr>
                       <w:rFonts w:ascii="Cambria Math" w:eastAsiaTheme="minorEastAsia" w:hAnsi="Cambria Math"/>
                     </w:rPr>
-                    <m:t>2π*60t-</m:t>
-                  </m:r>
-                  <m:r>
-                    <w:rPr>
-                      <w:rFonts w:ascii="Cambria Math" w:eastAsiaTheme="minorEastAsia" w:hAnsi="Cambria Math"/>
-                    </w:rPr>
-                    <m:t>75.14</m:t>
-                  </m:r>
-                  <m:r>
-                    <w:rPr>
-                      <w:rFonts w:ascii="Cambria Math" w:eastAsiaTheme="minorEastAsia" w:hAnsi="Cambria Math"/>
-                    </w:rPr>
-                    <m:t>°</m:t>
+                    <m:t>2π*60t-75.14°</m:t>
                   </m:r>
                 </m:e>
               </m:d>
@@ -1409,6 +1342,9 @@
         <w:keepNext/>
       </w:pPr>
       <w:r>
+        <w:rPr>
+          <w:noProof/>
+        </w:rPr>
         <w:lastRenderedPageBreak/>
         <w:drawing>
           <wp:inline distT="0" distB="0" distL="0" distR="0" wp14:anchorId="2D032398" wp14:editId="6C794D6A">
@@ -1483,6 +1419,9 @@
         <w:keepNext/>
       </w:pPr>
       <w:r>
+        <w:rPr>
+          <w:noProof/>
+        </w:rPr>
         <w:drawing>
           <wp:inline distT="0" distB="0" distL="0" distR="0" wp14:anchorId="738E1B49" wp14:editId="0030FC54">
             <wp:extent cx="5731510" cy="2922270"/>
@@ -1963,27 +1902,23 @@
             <w:rPr>
               <w:rFonts w:ascii="Cambria Math" w:eastAsiaTheme="minorEastAsia" w:hAnsi="Cambria Math"/>
             </w:rPr>
-            <m:t>=</m:t>
+            <m:t>=175.67W</m:t>
           </m:r>
           <m:r>
-            <w:rPr>
-              <w:rFonts w:ascii="Cambria Math" w:eastAsiaTheme="minorEastAsia" w:hAnsi="Cambria Math"/>
-            </w:rPr>
-            <m:t>175.67</m:t>
-          </m:r>
-          <m:r>
-            <w:rPr>
-              <w:rFonts w:ascii="Cambria Math" w:eastAsiaTheme="minorEastAsia" w:hAnsi="Cambria Math"/>
-            </w:rPr>
-            <m:t>W</m:t>
-          </m:r>
-          <m:r>
+            <m:rPr>
+              <m:sty m:val="p"/>
+            </m:rPr>
             <w:rPr>
               <w:rFonts w:ascii="Cambria Math" w:eastAsiaTheme="minorEastAsia" w:hAnsi="Cambria Math"/>
             </w:rPr>
             <w:br/>
           </m:r>
+        </m:oMath>
+        <m:oMath>
           <m:r>
+            <m:rPr>
+              <m:sty m:val="p"/>
+            </m:rPr>
             <w:br/>
           </m:r>
         </m:oMath>
@@ -2010,13 +1945,7 @@
                 <w:rPr>
                   <w:rFonts w:ascii="Cambria Math" w:hAnsi="Cambria Math"/>
                 </w:rPr>
-                <m:t>2</m:t>
-              </m:r>
-              <m:r>
-                <w:rPr>
-                  <w:rFonts w:ascii="Cambria Math" w:hAnsi="Cambria Math"/>
-                </w:rPr>
-                <m:t>rms</m:t>
+                <m:t>2rms</m:t>
               </m:r>
             </m:sub>
           </m:sSub>
@@ -2078,13 +2007,7 @@
                             <w:rPr>
                               <w:rFonts w:ascii="Cambria Math" w:hAnsi="Cambria Math"/>
                             </w:rPr>
-                            <m:t>2</m:t>
-                          </m:r>
-                          <m:r>
-                            <w:rPr>
-                              <w:rFonts w:ascii="Cambria Math" w:hAnsi="Cambria Math"/>
-                            </w:rPr>
-                            <m:t>rms</m:t>
+                            <m:t>2rms</m:t>
                           </m:r>
                         </m:sub>
                       </m:sSub>
@@ -2212,21 +2135,12 @@
             <w:rPr>
               <w:rFonts w:ascii="Cambria Math" w:eastAsiaTheme="minorEastAsia" w:hAnsi="Cambria Math"/>
             </w:rPr>
-            <m:t>=1</m:t>
+            <m:t>=118.33W</m:t>
           </m:r>
           <m:r>
-            <w:rPr>
-              <w:rFonts w:ascii="Cambria Math" w:eastAsiaTheme="minorEastAsia" w:hAnsi="Cambria Math"/>
-            </w:rPr>
-            <m:t>18.33</m:t>
-          </m:r>
-          <m:r>
-            <w:rPr>
-              <w:rFonts w:ascii="Cambria Math" w:eastAsiaTheme="minorEastAsia" w:hAnsi="Cambria Math"/>
-            </w:rPr>
-            <m:t>W</m:t>
-          </m:r>
-          <m:r>
+            <m:rPr>
+              <m:sty m:val="p"/>
+            </m:rPr>
             <w:rPr>
               <w:rFonts w:ascii="Cambria Math" w:eastAsiaTheme="minorEastAsia" w:hAnsi="Cambria Math"/>
             </w:rPr>
@@ -2363,18 +2277,31 @@
             <m:t>=900+ 175.67+118.33=1193.97W</m:t>
           </m:r>
           <m:r>
+            <m:rPr>
+              <m:sty m:val="p"/>
+            </m:rPr>
             <w:rPr>
               <w:rFonts w:eastAsiaTheme="minorEastAsia"/>
             </w:rPr>
             <w:br/>
           </m:r>
+        </m:oMath>
+        <m:oMath>
           <m:r>
+            <m:rPr>
+              <m:sty m:val="p"/>
+            </m:rPr>
             <w:rPr>
               <w:rFonts w:eastAsiaTheme="minorEastAsia"/>
             </w:rPr>
             <w:br/>
           </m:r>
+        </m:oMath>
+        <m:oMath>
           <m:r>
+            <m:rPr>
+              <m:sty m:val="p"/>
+            </m:rPr>
             <w:rPr>
               <w:rFonts w:eastAsiaTheme="minorEastAsia"/>
             </w:rPr>
@@ -2383,6 +2310,9 @@
         </m:oMath>
       </m:oMathPara>
       <w:r>
+        <w:rPr>
+          <w:noProof/>
+        </w:rPr>
         <w:drawing>
           <wp:inline distT="0" distB="0" distL="0" distR="0" wp14:anchorId="3676763F" wp14:editId="34202A71">
             <wp:extent cx="5731510" cy="2778125"/>
@@ -2460,6 +2390,8 @@
         <w:br/>
       </w:r>
     </w:p>
+    <w:p/>
+    <w:p/>
     <w:sectPr>
       <w:pgSz w:w="11906" w:h="16838"/>
       <w:pgMar w:top="1440" w:right="1440" w:bottom="1440" w:left="1440" w:header="708" w:footer="708" w:gutter="0"/>

</xml_diff>

<commit_message>
complted question 1 for 3091 proj b
</commit_message>
<xml_diff>
--- a/EEE3091/Power electronics project part b.docx
+++ b/EEE3091/Power electronics project part b.docx
@@ -1347,10 +1347,10 @@
         </w:rPr>
         <w:lastRenderedPageBreak/>
         <w:drawing>
-          <wp:inline distT="0" distB="0" distL="0" distR="0" wp14:anchorId="2D032398" wp14:editId="6C794D6A">
+          <wp:inline distT="0" distB="0" distL="0" distR="0" wp14:anchorId="42C6EF0A" wp14:editId="5909F969">
             <wp:extent cx="5731510" cy="2778125"/>
             <wp:effectExtent l="0" t="0" r="2540" b="3175"/>
-            <wp:docPr id="3" name="Picture 3"/>
+            <wp:docPr id="8" name="Picture 8"/>
             <wp:cNvGraphicFramePr>
               <a:graphicFrameLocks xmlns:a="http://schemas.openxmlformats.org/drawingml/2006/main" noChangeAspect="1"/>
             </wp:cNvGraphicFramePr>
@@ -2314,10 +2314,10 @@
           <w:noProof/>
         </w:rPr>
         <w:drawing>
-          <wp:inline distT="0" distB="0" distL="0" distR="0" wp14:anchorId="3676763F" wp14:editId="34202A71">
+          <wp:inline distT="0" distB="0" distL="0" distR="0" wp14:anchorId="12D5843E" wp14:editId="49EFAE60">
             <wp:extent cx="5731510" cy="2778125"/>
             <wp:effectExtent l="0" t="0" r="2540" b="3175"/>
-            <wp:docPr id="6" name="Picture 6"/>
+            <wp:docPr id="10" name="Picture 10"/>
             <wp:cNvGraphicFramePr>
               <a:graphicFrameLocks xmlns:a="http://schemas.openxmlformats.org/drawingml/2006/main" noChangeAspect="1"/>
             </wp:cNvGraphicFramePr>
@@ -2378,19 +2378,1916 @@
       <w:r>
         <w:t xml:space="preserve"> plot of </w:t>
       </w:r>
-      <w:proofErr w:type="spellStart"/>
-      <w:r>
-        <w:t>instantenous</w:t>
-      </w:r>
-      <w:proofErr w:type="spellEnd"/>
+      <w:r>
+        <w:t>instantaneous</w:t>
+      </w:r>
       <w:r>
         <w:t xml:space="preserve"> voltage</w:t>
       </w:r>
       <w:r>
         <w:br/>
+      </w:r>
+    </w:p>
+    <w:p>
+      <w:pPr>
+        <w:keepNext/>
+      </w:pPr>
+      <w:r>
+        <w:drawing>
+          <wp:inline distT="0" distB="0" distL="0" distR="0" wp14:anchorId="26AD48C2" wp14:editId="60CD058E">
+            <wp:extent cx="1657581" cy="828791"/>
+            <wp:effectExtent l="0" t="0" r="0" b="9525"/>
+            <wp:docPr id="11" name="Picture 11"/>
+            <wp:cNvGraphicFramePr>
+              <a:graphicFrameLocks xmlns:a="http://schemas.openxmlformats.org/drawingml/2006/main" noChangeAspect="1"/>
+            </wp:cNvGraphicFramePr>
+            <a:graphic xmlns:a="http://schemas.openxmlformats.org/drawingml/2006/main">
+              <a:graphicData uri="http://schemas.openxmlformats.org/drawingml/2006/picture">
+                <pic:pic xmlns:pic="http://schemas.openxmlformats.org/drawingml/2006/picture">
+                  <pic:nvPicPr>
+                    <pic:cNvPr id="1" name=""/>
+                    <pic:cNvPicPr/>
+                  </pic:nvPicPr>
+                  <pic:blipFill>
+                    <a:blip r:embed="rId9"/>
+                    <a:stretch>
+                      <a:fillRect/>
+                    </a:stretch>
+                  </pic:blipFill>
+                  <pic:spPr>
+                    <a:xfrm>
+                      <a:off x="0" y="0"/>
+                      <a:ext cx="1657581" cy="828791"/>
+                    </a:xfrm>
+                    <a:prstGeom prst="rect">
+                      <a:avLst/>
+                    </a:prstGeom>
+                  </pic:spPr>
+                </pic:pic>
+              </a:graphicData>
+            </a:graphic>
+          </wp:inline>
+        </w:drawing>
+      </w:r>
+    </w:p>
+    <w:p>
+      <w:pPr>
+        <w:pStyle w:val="Caption"/>
+      </w:pPr>
+      <w:r>
+        <w:t xml:space="preserve">Figure </w:t>
+      </w:r>
+      <w:r>
+        <w:fldChar w:fldCharType="begin"/>
+      </w:r>
+      <w:r>
+        <w:instrText xml:space="preserve"> SEQ Figure \* ARABIC </w:instrText>
+      </w:r>
+      <w:r>
+        <w:fldChar w:fldCharType="separate"/>
+      </w:r>
+      <w:r>
+        <w:rPr>
+          <w:noProof/>
+        </w:rPr>
+        <w:t>4</w:t>
+      </w:r>
+      <w:r>
+        <w:fldChar w:fldCharType="end"/>
+      </w:r>
+      <w:r>
+        <w:t xml:space="preserve"> average power from simulation</w:t>
+      </w:r>
+    </w:p>
+    <w:p>
+      <w:r>
+        <w:t xml:space="preserve">By taking the product of the instantaneous voltage and current and then taking the average we can find the average power. We see that the measured values agree with the calculated values of 1193.97W. </w:t>
+      </w:r>
+    </w:p>
+    <w:p>
+      <w:r>
+        <w:t>By increasing the capacitance, we see a decrease in the total average power however average voltage will not decrease. While increasing the capacitance the average power of the DC component stays constant however the average power for each of the AC harmonics decreases.</w:t>
+      </w:r>
+      <w:r>
+        <w:t xml:space="preserve"> As the capacitance will lower the capacitors impedance at 60 and 120HZ</w:t>
       </w:r>
     </w:p>
     <w:p/>
+    <w:p>
+      <w:pPr>
+        <w:pStyle w:val="ListParagraph"/>
+        <w:numPr>
+          <w:ilvl w:val="0"/>
+          <w:numId w:val="1"/>
+        </w:numPr>
+      </w:pPr>
+      <w:r>
+        <w:t xml:space="preserve">RMS voltage </w:t>
+      </w:r>
+      <w:r>
+        <w:br/>
+      </w:r>
+      <m:oMathPara>
+        <m:oMath>
+          <m:sSub>
+            <m:sSubPr>
+              <m:ctrlPr>
+                <w:rPr>
+                  <w:rFonts w:ascii="Cambria Math" w:hAnsi="Cambria Math"/>
+                  <w:i/>
+                </w:rPr>
+              </m:ctrlPr>
+            </m:sSubPr>
+            <m:e>
+              <m:r>
+                <w:rPr>
+                  <w:rFonts w:ascii="Cambria Math" w:hAnsi="Cambria Math"/>
+                </w:rPr>
+                <m:t>V</m:t>
+              </m:r>
+            </m:e>
+            <m:sub>
+              <m:r>
+                <w:rPr>
+                  <w:rFonts w:ascii="Cambria Math" w:hAnsi="Cambria Math"/>
+                </w:rPr>
+                <m:t>DC</m:t>
+              </m:r>
+            </m:sub>
+          </m:sSub>
+          <m:r>
+            <w:rPr>
+              <w:rFonts w:ascii="Cambria Math" w:hAnsi="Cambria Math"/>
+            </w:rPr>
+            <m:t>=300V</m:t>
+          </m:r>
+          <m:r>
+            <w:rPr>
+              <w:rFonts w:ascii="Cambria Math" w:hAnsi="Cambria Math"/>
+            </w:rPr>
+            <w:br/>
+          </m:r>
+        </m:oMath>
+        <m:oMath>
+          <m:sSub>
+            <m:sSubPr>
+              <m:ctrlPr>
+                <w:rPr>
+                  <w:rFonts w:ascii="Cambria Math" w:hAnsi="Cambria Math"/>
+                  <w:i/>
+                </w:rPr>
+              </m:ctrlPr>
+            </m:sSubPr>
+            <m:e>
+              <m:r>
+                <w:rPr>
+                  <w:rFonts w:ascii="Cambria Math" w:hAnsi="Cambria Math"/>
+                </w:rPr>
+                <m:t>V</m:t>
+              </m:r>
+            </m:e>
+            <m:sub>
+              <m:r>
+                <w:rPr>
+                  <w:rFonts w:ascii="Cambria Math" w:hAnsi="Cambria Math"/>
+                </w:rPr>
+                <m:t>1,rms</m:t>
+              </m:r>
+            </m:sub>
+          </m:sSub>
+          <m:r>
+            <w:rPr>
+              <w:rFonts w:ascii="Cambria Math" w:eastAsiaTheme="minorEastAsia" w:hAnsi="Cambria Math"/>
+            </w:rPr>
+            <m:t>=</m:t>
+          </m:r>
+          <m:f>
+            <m:fPr>
+              <m:ctrlPr>
+                <w:rPr>
+                  <w:rFonts w:ascii="Cambria Math" w:eastAsiaTheme="minorEastAsia" w:hAnsi="Cambria Math"/>
+                  <w:i/>
+                </w:rPr>
+              </m:ctrlPr>
+            </m:fPr>
+            <m:num>
+              <m:r>
+                <w:rPr>
+                  <w:rFonts w:ascii="Cambria Math" w:eastAsiaTheme="minorEastAsia" w:hAnsi="Cambria Math"/>
+                </w:rPr>
+                <m:t>187.44</m:t>
+              </m:r>
+            </m:num>
+            <m:den>
+              <m:rad>
+                <m:radPr>
+                  <m:degHide m:val="1"/>
+                  <m:ctrlPr>
+                    <w:rPr>
+                      <w:rFonts w:ascii="Cambria Math" w:eastAsiaTheme="minorEastAsia" w:hAnsi="Cambria Math"/>
+                      <w:i/>
+                    </w:rPr>
+                  </m:ctrlPr>
+                </m:radPr>
+                <m:deg/>
+                <m:e>
+                  <m:r>
+                    <w:rPr>
+                      <w:rFonts w:ascii="Cambria Math" w:eastAsiaTheme="minorEastAsia" w:hAnsi="Cambria Math"/>
+                    </w:rPr>
+                    <m:t>2</m:t>
+                  </m:r>
+                </m:e>
+              </m:rad>
+            </m:den>
+          </m:f>
+          <m:r>
+            <w:rPr>
+              <w:rFonts w:ascii="Cambria Math" w:eastAsiaTheme="minorEastAsia" w:hAnsi="Cambria Math"/>
+            </w:rPr>
+            <m:t>=132.54V</m:t>
+          </m:r>
+          <m:r>
+            <w:rPr>
+              <w:rFonts w:ascii="Cambria Math" w:eastAsiaTheme="minorEastAsia" w:hAnsi="Cambria Math"/>
+            </w:rPr>
+            <w:br/>
+          </m:r>
+        </m:oMath>
+        <m:oMath>
+          <m:sSub>
+            <m:sSubPr>
+              <m:ctrlPr>
+                <w:rPr>
+                  <w:rFonts w:ascii="Cambria Math" w:hAnsi="Cambria Math"/>
+                  <w:i/>
+                </w:rPr>
+              </m:ctrlPr>
+            </m:sSubPr>
+            <m:e>
+              <m:r>
+                <w:rPr>
+                  <w:rFonts w:ascii="Cambria Math" w:hAnsi="Cambria Math"/>
+                </w:rPr>
+                <m:t>V</m:t>
+              </m:r>
+            </m:e>
+            <m:sub>
+              <m:r>
+                <w:rPr>
+                  <w:rFonts w:ascii="Cambria Math" w:hAnsi="Cambria Math"/>
+                </w:rPr>
+                <m:t>2</m:t>
+              </m:r>
+              <m:r>
+                <w:rPr>
+                  <w:rFonts w:ascii="Cambria Math" w:hAnsi="Cambria Math"/>
+                </w:rPr>
+                <m:t>,rms</m:t>
+              </m:r>
+            </m:sub>
+          </m:sSub>
+          <m:r>
+            <w:rPr>
+              <w:rFonts w:ascii="Cambria Math" w:eastAsiaTheme="minorEastAsia" w:hAnsi="Cambria Math"/>
+            </w:rPr>
+            <m:t>=</m:t>
+          </m:r>
+          <m:f>
+            <m:fPr>
+              <m:ctrlPr>
+                <w:rPr>
+                  <w:rFonts w:ascii="Cambria Math" w:eastAsiaTheme="minorEastAsia" w:hAnsi="Cambria Math"/>
+                  <w:i/>
+                </w:rPr>
+              </m:ctrlPr>
+            </m:fPr>
+            <m:num>
+              <m:r>
+                <w:rPr>
+                  <w:rFonts w:ascii="Cambria Math" w:eastAsiaTheme="minorEastAsia" w:hAnsi="Cambria Math"/>
+                </w:rPr>
+                <m:t>153.84</m:t>
+              </m:r>
+            </m:num>
+            <m:den>
+              <m:rad>
+                <m:radPr>
+                  <m:degHide m:val="1"/>
+                  <m:ctrlPr>
+                    <w:rPr>
+                      <w:rFonts w:ascii="Cambria Math" w:eastAsiaTheme="minorEastAsia" w:hAnsi="Cambria Math"/>
+                      <w:i/>
+                    </w:rPr>
+                  </m:ctrlPr>
+                </m:radPr>
+                <m:deg/>
+                <m:e>
+                  <m:r>
+                    <w:rPr>
+                      <w:rFonts w:ascii="Cambria Math" w:eastAsiaTheme="minorEastAsia" w:hAnsi="Cambria Math"/>
+                    </w:rPr>
+                    <m:t>2</m:t>
+                  </m:r>
+                </m:e>
+              </m:rad>
+            </m:den>
+          </m:f>
+          <m:r>
+            <w:rPr>
+              <w:rFonts w:ascii="Cambria Math" w:eastAsiaTheme="minorEastAsia" w:hAnsi="Cambria Math"/>
+            </w:rPr>
+            <m:t>=1</m:t>
+          </m:r>
+          <m:r>
+            <w:rPr>
+              <w:rFonts w:ascii="Cambria Math" w:eastAsiaTheme="minorEastAsia" w:hAnsi="Cambria Math"/>
+            </w:rPr>
+            <m:t>08.78</m:t>
+          </m:r>
+          <m:r>
+            <w:rPr>
+              <w:rFonts w:ascii="Cambria Math" w:eastAsiaTheme="minorEastAsia" w:hAnsi="Cambria Math"/>
+            </w:rPr>
+            <m:t>V</m:t>
+          </m:r>
+          <m:r>
+            <w:rPr>
+              <w:rFonts w:ascii="Cambria Math" w:eastAsiaTheme="minorEastAsia" w:hAnsi="Cambria Math"/>
+            </w:rPr>
+            <w:br/>
+          </m:r>
+        </m:oMath>
+        <m:oMath>
+          <m:sSub>
+            <m:sSubPr>
+              <m:ctrlPr>
+                <w:rPr>
+                  <w:rFonts w:ascii="Cambria Math" w:eastAsiaTheme="minorEastAsia" w:hAnsi="Cambria Math"/>
+                  <w:i/>
+                </w:rPr>
+              </m:ctrlPr>
+            </m:sSubPr>
+            <m:e>
+              <m:r>
+                <w:rPr>
+                  <w:rFonts w:ascii="Cambria Math" w:eastAsiaTheme="minorEastAsia" w:hAnsi="Cambria Math"/>
+                </w:rPr>
+                <m:t>V</m:t>
+              </m:r>
+            </m:e>
+            <m:sub>
+              <m:r>
+                <w:rPr>
+                  <w:rFonts w:ascii="Cambria Math" w:eastAsiaTheme="minorEastAsia" w:hAnsi="Cambria Math"/>
+                </w:rPr>
+                <m:t>rms</m:t>
+              </m:r>
+            </m:sub>
+          </m:sSub>
+          <m:r>
+            <w:rPr>
+              <w:rFonts w:ascii="Cambria Math" w:eastAsiaTheme="minorEastAsia" w:hAnsi="Cambria Math"/>
+            </w:rPr>
+            <m:t>=</m:t>
+          </m:r>
+          <m:rad>
+            <m:radPr>
+              <m:degHide m:val="1"/>
+              <m:ctrlPr>
+                <w:rPr>
+                  <w:rFonts w:ascii="Cambria Math" w:eastAsiaTheme="minorEastAsia" w:hAnsi="Cambria Math"/>
+                  <w:i/>
+                </w:rPr>
+              </m:ctrlPr>
+            </m:radPr>
+            <m:deg/>
+            <m:e>
+              <m:sSubSup>
+                <m:sSubSupPr>
+                  <m:ctrlPr>
+                    <w:rPr>
+                      <w:rFonts w:ascii="Cambria Math" w:eastAsiaTheme="minorEastAsia" w:hAnsi="Cambria Math"/>
+                      <w:i/>
+                    </w:rPr>
+                  </m:ctrlPr>
+                </m:sSubSupPr>
+                <m:e>
+                  <m:r>
+                    <w:rPr>
+                      <w:rFonts w:ascii="Cambria Math" w:eastAsiaTheme="minorEastAsia" w:hAnsi="Cambria Math"/>
+                    </w:rPr>
+                    <m:t>V</m:t>
+                  </m:r>
+                </m:e>
+                <m:sub>
+                  <m:r>
+                    <w:rPr>
+                      <w:rFonts w:ascii="Cambria Math" w:eastAsiaTheme="minorEastAsia" w:hAnsi="Cambria Math"/>
+                    </w:rPr>
+                    <m:t>DC</m:t>
+                  </m:r>
+                </m:sub>
+                <m:sup>
+                  <m:r>
+                    <w:rPr>
+                      <w:rFonts w:ascii="Cambria Math" w:eastAsiaTheme="minorEastAsia" w:hAnsi="Cambria Math"/>
+                    </w:rPr>
+                    <m:t>2</m:t>
+                  </m:r>
+                </m:sup>
+              </m:sSubSup>
+              <m:r>
+                <w:rPr>
+                  <w:rFonts w:ascii="Cambria Math" w:eastAsiaTheme="minorEastAsia" w:hAnsi="Cambria Math"/>
+                </w:rPr>
+                <m:t>+</m:t>
+              </m:r>
+              <m:sSubSup>
+                <m:sSubSupPr>
+                  <m:ctrlPr>
+                    <w:rPr>
+                      <w:rFonts w:ascii="Cambria Math" w:eastAsiaTheme="minorEastAsia" w:hAnsi="Cambria Math"/>
+                      <w:i/>
+                    </w:rPr>
+                  </m:ctrlPr>
+                </m:sSubSupPr>
+                <m:e>
+                  <m:r>
+                    <w:rPr>
+                      <w:rFonts w:ascii="Cambria Math" w:eastAsiaTheme="minorEastAsia" w:hAnsi="Cambria Math"/>
+                    </w:rPr>
+                    <m:t>V</m:t>
+                  </m:r>
+                </m:e>
+                <m:sub>
+                  <m:r>
+                    <w:rPr>
+                      <w:rFonts w:ascii="Cambria Math" w:eastAsiaTheme="minorEastAsia" w:hAnsi="Cambria Math"/>
+                    </w:rPr>
+                    <m:t>1,rms</m:t>
+                  </m:r>
+                </m:sub>
+                <m:sup>
+                  <m:r>
+                    <w:rPr>
+                      <w:rFonts w:ascii="Cambria Math" w:eastAsiaTheme="minorEastAsia" w:hAnsi="Cambria Math"/>
+                    </w:rPr>
+                    <m:t>2</m:t>
+                  </m:r>
+                </m:sup>
+              </m:sSubSup>
+              <m:r>
+                <w:rPr>
+                  <w:rFonts w:ascii="Cambria Math" w:eastAsiaTheme="minorEastAsia" w:hAnsi="Cambria Math"/>
+                </w:rPr>
+                <m:t>+</m:t>
+              </m:r>
+              <m:sSubSup>
+                <m:sSubSupPr>
+                  <m:ctrlPr>
+                    <w:rPr>
+                      <w:rFonts w:ascii="Cambria Math" w:eastAsiaTheme="minorEastAsia" w:hAnsi="Cambria Math"/>
+                      <w:i/>
+                    </w:rPr>
+                  </m:ctrlPr>
+                </m:sSubSupPr>
+                <m:e>
+                  <m:r>
+                    <w:rPr>
+                      <w:rFonts w:ascii="Cambria Math" w:eastAsiaTheme="minorEastAsia" w:hAnsi="Cambria Math"/>
+                    </w:rPr>
+                    <m:t>V</m:t>
+                  </m:r>
+                </m:e>
+                <m:sub>
+                  <m:r>
+                    <w:rPr>
+                      <w:rFonts w:ascii="Cambria Math" w:eastAsiaTheme="minorEastAsia" w:hAnsi="Cambria Math"/>
+                    </w:rPr>
+                    <m:t>2,rms</m:t>
+                  </m:r>
+                </m:sub>
+                <m:sup/>
+              </m:sSubSup>
+            </m:e>
+          </m:rad>
+          <m:r>
+            <w:rPr>
+              <w:rFonts w:ascii="Cambria Math" w:eastAsiaTheme="minorEastAsia" w:hAnsi="Cambria Math"/>
+            </w:rPr>
+            <m:t>=</m:t>
+          </m:r>
+          <m:rad>
+            <m:radPr>
+              <m:degHide m:val="1"/>
+              <m:ctrlPr>
+                <w:rPr>
+                  <w:rFonts w:ascii="Cambria Math" w:eastAsiaTheme="minorEastAsia" w:hAnsi="Cambria Math"/>
+                  <w:i/>
+                </w:rPr>
+              </m:ctrlPr>
+            </m:radPr>
+            <m:deg/>
+            <m:e>
+              <m:sSup>
+                <m:sSupPr>
+                  <m:ctrlPr>
+                    <w:rPr>
+                      <w:rFonts w:ascii="Cambria Math" w:eastAsiaTheme="minorEastAsia" w:hAnsi="Cambria Math"/>
+                      <w:i/>
+                    </w:rPr>
+                  </m:ctrlPr>
+                </m:sSupPr>
+                <m:e>
+                  <m:r>
+                    <w:rPr>
+                      <w:rFonts w:ascii="Cambria Math" w:eastAsiaTheme="minorEastAsia" w:hAnsi="Cambria Math"/>
+                    </w:rPr>
+                    <m:t>300</m:t>
+                  </m:r>
+                </m:e>
+                <m:sup>
+                  <m:r>
+                    <w:rPr>
+                      <w:rFonts w:ascii="Cambria Math" w:eastAsiaTheme="minorEastAsia" w:hAnsi="Cambria Math"/>
+                    </w:rPr>
+                    <m:t>2</m:t>
+                  </m:r>
+                </m:sup>
+              </m:sSup>
+              <m:r>
+                <w:rPr>
+                  <w:rFonts w:ascii="Cambria Math" w:eastAsiaTheme="minorEastAsia" w:hAnsi="Cambria Math"/>
+                </w:rPr>
+                <m:t>+</m:t>
+              </m:r>
+              <m:sSup>
+                <m:sSupPr>
+                  <m:ctrlPr>
+                    <w:rPr>
+                      <w:rFonts w:ascii="Cambria Math" w:eastAsiaTheme="minorEastAsia" w:hAnsi="Cambria Math"/>
+                      <w:i/>
+                    </w:rPr>
+                  </m:ctrlPr>
+                </m:sSupPr>
+                <m:e>
+                  <m:r>
+                    <w:rPr>
+                      <w:rFonts w:ascii="Cambria Math" w:eastAsiaTheme="minorEastAsia" w:hAnsi="Cambria Math"/>
+                    </w:rPr>
+                    <m:t>132.54</m:t>
+                  </m:r>
+                </m:e>
+                <m:sup>
+                  <m:r>
+                    <w:rPr>
+                      <w:rFonts w:ascii="Cambria Math" w:eastAsiaTheme="minorEastAsia" w:hAnsi="Cambria Math"/>
+                    </w:rPr>
+                    <m:t>2</m:t>
+                  </m:r>
+                </m:sup>
+              </m:sSup>
+              <m:r>
+                <w:rPr>
+                  <w:rFonts w:ascii="Cambria Math" w:eastAsiaTheme="minorEastAsia" w:hAnsi="Cambria Math"/>
+                </w:rPr>
+                <m:t>+</m:t>
+              </m:r>
+              <m:sSup>
+                <m:sSupPr>
+                  <m:ctrlPr>
+                    <w:rPr>
+                      <w:rFonts w:ascii="Cambria Math" w:eastAsiaTheme="minorEastAsia" w:hAnsi="Cambria Math"/>
+                      <w:i/>
+                    </w:rPr>
+                  </m:ctrlPr>
+                </m:sSupPr>
+                <m:e>
+                  <m:r>
+                    <w:rPr>
+                      <w:rFonts w:ascii="Cambria Math" w:eastAsiaTheme="minorEastAsia" w:hAnsi="Cambria Math"/>
+                    </w:rPr>
+                    <m:t>108.78</m:t>
+                  </m:r>
+                </m:e>
+                <m:sup>
+                  <m:r>
+                    <w:rPr>
+                      <w:rFonts w:ascii="Cambria Math" w:eastAsiaTheme="minorEastAsia" w:hAnsi="Cambria Math"/>
+                    </w:rPr>
+                    <m:t>2</m:t>
+                  </m:r>
+                </m:sup>
+              </m:sSup>
+            </m:e>
+          </m:rad>
+          <m:r>
+            <w:rPr>
+              <w:rFonts w:ascii="Cambria Math" w:eastAsiaTheme="minorEastAsia" w:hAnsi="Cambria Math"/>
+            </w:rPr>
+            <m:t>=345.5V</m:t>
+          </m:r>
+          <m:r>
+            <w:rPr>
+              <w:rFonts w:ascii="Cambria Math" w:eastAsiaTheme="minorEastAsia" w:hAnsi="Cambria Math"/>
+            </w:rPr>
+            <w:br/>
+          </m:r>
+        </m:oMath>
+      </m:oMathPara>
+    </w:p>
+    <w:p>
+      <w:r>
+        <w:t xml:space="preserve">RMS current </w:t>
+      </w:r>
+      <w:r>
+        <w:br/>
+      </w:r>
+      <m:oMathPara>
+        <m:oMath>
+          <m:sSub>
+            <m:sSubPr>
+              <m:ctrlPr>
+                <w:rPr>
+                  <w:rFonts w:ascii="Cambria Math" w:hAnsi="Cambria Math"/>
+                  <w:i/>
+                </w:rPr>
+              </m:ctrlPr>
+            </m:sSubPr>
+            <m:e>
+              <m:r>
+                <w:rPr>
+                  <w:rFonts w:ascii="Cambria Math" w:hAnsi="Cambria Math"/>
+                </w:rPr>
+                <m:t>I</m:t>
+              </m:r>
+            </m:e>
+            <m:sub>
+              <m:r>
+                <w:rPr>
+                  <w:rFonts w:ascii="Cambria Math" w:hAnsi="Cambria Math"/>
+                </w:rPr>
+                <m:t>DC</m:t>
+              </m:r>
+            </m:sub>
+          </m:sSub>
+          <m:r>
+            <w:rPr>
+              <w:rFonts w:ascii="Cambria Math" w:hAnsi="Cambria Math"/>
+            </w:rPr>
+            <m:t>=</m:t>
+          </m:r>
+          <m:r>
+            <w:rPr>
+              <w:rFonts w:ascii="Cambria Math" w:hAnsi="Cambria Math"/>
+            </w:rPr>
+            <m:t>3A</m:t>
+          </m:r>
+          <m:r>
+            <w:rPr>
+              <w:rFonts w:ascii="Cambria Math" w:hAnsi="Cambria Math"/>
+            </w:rPr>
+            <w:br/>
+          </m:r>
+        </m:oMath>
+        <m:oMath>
+          <m:sSub>
+            <m:sSubPr>
+              <m:ctrlPr>
+                <w:rPr>
+                  <w:rFonts w:ascii="Cambria Math" w:hAnsi="Cambria Math"/>
+                  <w:i/>
+                </w:rPr>
+              </m:ctrlPr>
+            </m:sSubPr>
+            <m:e>
+              <m:r>
+                <w:rPr>
+                  <w:rFonts w:ascii="Cambria Math" w:hAnsi="Cambria Math"/>
+                </w:rPr>
+                <m:t>I</m:t>
+              </m:r>
+            </m:e>
+            <m:sub>
+              <m:r>
+                <w:rPr>
+                  <w:rFonts w:ascii="Cambria Math" w:hAnsi="Cambria Math"/>
+                </w:rPr>
+                <m:t>1,rms</m:t>
+              </m:r>
+            </m:sub>
+          </m:sSub>
+          <m:r>
+            <w:rPr>
+              <w:rFonts w:ascii="Cambria Math" w:eastAsiaTheme="minorEastAsia" w:hAnsi="Cambria Math"/>
+            </w:rPr>
+            <m:t>=</m:t>
+          </m:r>
+          <m:f>
+            <m:fPr>
+              <m:ctrlPr>
+                <w:rPr>
+                  <w:rFonts w:ascii="Cambria Math" w:eastAsiaTheme="minorEastAsia" w:hAnsi="Cambria Math"/>
+                  <w:i/>
+                </w:rPr>
+              </m:ctrlPr>
+            </m:fPr>
+            <m:num>
+              <m:r>
+                <w:rPr>
+                  <w:rFonts w:ascii="Cambria Math" w:eastAsiaTheme="minorEastAsia" w:hAnsi="Cambria Math"/>
+                </w:rPr>
+                <m:t>4</m:t>
+              </m:r>
+            </m:num>
+            <m:den>
+              <m:rad>
+                <m:radPr>
+                  <m:degHide m:val="1"/>
+                  <m:ctrlPr>
+                    <w:rPr>
+                      <w:rFonts w:ascii="Cambria Math" w:eastAsiaTheme="minorEastAsia" w:hAnsi="Cambria Math"/>
+                      <w:i/>
+                    </w:rPr>
+                  </m:ctrlPr>
+                </m:radPr>
+                <m:deg/>
+                <m:e>
+                  <m:r>
+                    <w:rPr>
+                      <w:rFonts w:ascii="Cambria Math" w:eastAsiaTheme="minorEastAsia" w:hAnsi="Cambria Math"/>
+                    </w:rPr>
+                    <m:t>2</m:t>
+                  </m:r>
+                </m:e>
+              </m:rad>
+            </m:den>
+          </m:f>
+          <m:r>
+            <w:rPr>
+              <w:rFonts w:ascii="Cambria Math" w:eastAsiaTheme="minorEastAsia" w:hAnsi="Cambria Math"/>
+            </w:rPr>
+            <m:t>=</m:t>
+          </m:r>
+          <m:r>
+            <w:rPr>
+              <w:rFonts w:ascii="Cambria Math" w:eastAsiaTheme="minorEastAsia" w:hAnsi="Cambria Math"/>
+            </w:rPr>
+            <m:t>2.828A</m:t>
+          </m:r>
+          <m:r>
+            <w:rPr>
+              <w:rFonts w:ascii="Cambria Math" w:eastAsiaTheme="minorEastAsia" w:hAnsi="Cambria Math"/>
+            </w:rPr>
+            <w:br/>
+          </m:r>
+        </m:oMath>
+        <m:oMath>
+          <m:sSub>
+            <m:sSubPr>
+              <m:ctrlPr>
+                <w:rPr>
+                  <w:rFonts w:ascii="Cambria Math" w:hAnsi="Cambria Math"/>
+                  <w:i/>
+                </w:rPr>
+              </m:ctrlPr>
+            </m:sSubPr>
+            <m:e>
+              <m:r>
+                <w:rPr>
+                  <w:rFonts w:ascii="Cambria Math" w:hAnsi="Cambria Math"/>
+                </w:rPr>
+                <m:t>I</m:t>
+              </m:r>
+            </m:e>
+            <m:sub>
+              <m:r>
+                <w:rPr>
+                  <w:rFonts w:ascii="Cambria Math" w:hAnsi="Cambria Math"/>
+                </w:rPr>
+                <m:t>2,rms</m:t>
+              </m:r>
+            </m:sub>
+          </m:sSub>
+          <m:r>
+            <w:rPr>
+              <w:rFonts w:ascii="Cambria Math" w:eastAsiaTheme="minorEastAsia" w:hAnsi="Cambria Math"/>
+            </w:rPr>
+            <m:t>=</m:t>
+          </m:r>
+          <m:f>
+            <m:fPr>
+              <m:ctrlPr>
+                <w:rPr>
+                  <w:rFonts w:ascii="Cambria Math" w:eastAsiaTheme="minorEastAsia" w:hAnsi="Cambria Math"/>
+                  <w:i/>
+                </w:rPr>
+              </m:ctrlPr>
+            </m:fPr>
+            <m:num>
+              <m:r>
+                <w:rPr>
+                  <w:rFonts w:ascii="Cambria Math" w:eastAsiaTheme="minorEastAsia" w:hAnsi="Cambria Math"/>
+                </w:rPr>
+                <m:t>6</m:t>
+              </m:r>
+            </m:num>
+            <m:den>
+              <m:rad>
+                <m:radPr>
+                  <m:degHide m:val="1"/>
+                  <m:ctrlPr>
+                    <w:rPr>
+                      <w:rFonts w:ascii="Cambria Math" w:eastAsiaTheme="minorEastAsia" w:hAnsi="Cambria Math"/>
+                      <w:i/>
+                    </w:rPr>
+                  </m:ctrlPr>
+                </m:radPr>
+                <m:deg/>
+                <m:e>
+                  <m:r>
+                    <w:rPr>
+                      <w:rFonts w:ascii="Cambria Math" w:eastAsiaTheme="minorEastAsia" w:hAnsi="Cambria Math"/>
+                    </w:rPr>
+                    <m:t>2</m:t>
+                  </m:r>
+                </m:e>
+              </m:rad>
+            </m:den>
+          </m:f>
+          <m:r>
+            <w:rPr>
+              <w:rFonts w:ascii="Cambria Math" w:eastAsiaTheme="minorEastAsia" w:hAnsi="Cambria Math"/>
+            </w:rPr>
+            <m:t>=</m:t>
+          </m:r>
+          <m:r>
+            <w:rPr>
+              <w:rFonts w:ascii="Cambria Math" w:eastAsiaTheme="minorEastAsia" w:hAnsi="Cambria Math"/>
+            </w:rPr>
+            <m:t>4.242A</m:t>
+          </m:r>
+          <m:r>
+            <w:rPr>
+              <w:rFonts w:ascii="Cambria Math" w:eastAsiaTheme="minorEastAsia" w:hAnsi="Cambria Math"/>
+            </w:rPr>
+            <w:br/>
+          </m:r>
+        </m:oMath>
+        <m:oMath>
+          <m:sSub>
+            <m:sSubPr>
+              <m:ctrlPr>
+                <w:rPr>
+                  <w:rFonts w:ascii="Cambria Math" w:eastAsiaTheme="minorEastAsia" w:hAnsi="Cambria Math"/>
+                  <w:i/>
+                </w:rPr>
+              </m:ctrlPr>
+            </m:sSubPr>
+            <m:e>
+              <m:r>
+                <w:rPr>
+                  <w:rFonts w:ascii="Cambria Math" w:eastAsiaTheme="minorEastAsia" w:hAnsi="Cambria Math"/>
+                </w:rPr>
+                <m:t>I</m:t>
+              </m:r>
+            </m:e>
+            <m:sub>
+              <m:r>
+                <w:rPr>
+                  <w:rFonts w:ascii="Cambria Math" w:eastAsiaTheme="minorEastAsia" w:hAnsi="Cambria Math"/>
+                </w:rPr>
+                <m:t>rms</m:t>
+              </m:r>
+            </m:sub>
+          </m:sSub>
+          <m:r>
+            <w:rPr>
+              <w:rFonts w:ascii="Cambria Math" w:eastAsiaTheme="minorEastAsia" w:hAnsi="Cambria Math"/>
+            </w:rPr>
+            <m:t>=</m:t>
+          </m:r>
+          <m:rad>
+            <m:radPr>
+              <m:degHide m:val="1"/>
+              <m:ctrlPr>
+                <w:rPr>
+                  <w:rFonts w:ascii="Cambria Math" w:eastAsiaTheme="minorEastAsia" w:hAnsi="Cambria Math"/>
+                  <w:i/>
+                </w:rPr>
+              </m:ctrlPr>
+            </m:radPr>
+            <m:deg/>
+            <m:e>
+              <m:sSubSup>
+                <m:sSubSupPr>
+                  <m:ctrlPr>
+                    <w:rPr>
+                      <w:rFonts w:ascii="Cambria Math" w:eastAsiaTheme="minorEastAsia" w:hAnsi="Cambria Math"/>
+                      <w:i/>
+                    </w:rPr>
+                  </m:ctrlPr>
+                </m:sSubSupPr>
+                <m:e>
+                  <m:r>
+                    <w:rPr>
+                      <w:rFonts w:ascii="Cambria Math" w:eastAsiaTheme="minorEastAsia" w:hAnsi="Cambria Math"/>
+                    </w:rPr>
+                    <m:t>I</m:t>
+                  </m:r>
+                </m:e>
+                <m:sub>
+                  <m:r>
+                    <w:rPr>
+                      <w:rFonts w:ascii="Cambria Math" w:eastAsiaTheme="minorEastAsia" w:hAnsi="Cambria Math"/>
+                    </w:rPr>
+                    <m:t>DC</m:t>
+                  </m:r>
+                </m:sub>
+                <m:sup>
+                  <m:r>
+                    <w:rPr>
+                      <w:rFonts w:ascii="Cambria Math" w:eastAsiaTheme="minorEastAsia" w:hAnsi="Cambria Math"/>
+                    </w:rPr>
+                    <m:t>2</m:t>
+                  </m:r>
+                </m:sup>
+              </m:sSubSup>
+              <m:r>
+                <w:rPr>
+                  <w:rFonts w:ascii="Cambria Math" w:eastAsiaTheme="minorEastAsia" w:hAnsi="Cambria Math"/>
+                </w:rPr>
+                <m:t>+</m:t>
+              </m:r>
+              <m:sSubSup>
+                <m:sSubSupPr>
+                  <m:ctrlPr>
+                    <w:rPr>
+                      <w:rFonts w:ascii="Cambria Math" w:eastAsiaTheme="minorEastAsia" w:hAnsi="Cambria Math"/>
+                      <w:i/>
+                    </w:rPr>
+                  </m:ctrlPr>
+                </m:sSubSupPr>
+                <m:e>
+                  <m:r>
+                    <w:rPr>
+                      <w:rFonts w:ascii="Cambria Math" w:eastAsiaTheme="minorEastAsia" w:hAnsi="Cambria Math"/>
+                    </w:rPr>
+                    <m:t>I</m:t>
+                  </m:r>
+                </m:e>
+                <m:sub>
+                  <m:r>
+                    <w:rPr>
+                      <w:rFonts w:ascii="Cambria Math" w:eastAsiaTheme="minorEastAsia" w:hAnsi="Cambria Math"/>
+                    </w:rPr>
+                    <m:t>1,rms</m:t>
+                  </m:r>
+                </m:sub>
+                <m:sup>
+                  <m:r>
+                    <w:rPr>
+                      <w:rFonts w:ascii="Cambria Math" w:eastAsiaTheme="minorEastAsia" w:hAnsi="Cambria Math"/>
+                    </w:rPr>
+                    <m:t>2</m:t>
+                  </m:r>
+                </m:sup>
+              </m:sSubSup>
+              <m:r>
+                <w:rPr>
+                  <w:rFonts w:ascii="Cambria Math" w:eastAsiaTheme="minorEastAsia" w:hAnsi="Cambria Math"/>
+                </w:rPr>
+                <m:t>+</m:t>
+              </m:r>
+              <m:sSubSup>
+                <m:sSubSupPr>
+                  <m:ctrlPr>
+                    <w:rPr>
+                      <w:rFonts w:ascii="Cambria Math" w:eastAsiaTheme="minorEastAsia" w:hAnsi="Cambria Math"/>
+                      <w:i/>
+                    </w:rPr>
+                  </m:ctrlPr>
+                </m:sSubSupPr>
+                <m:e>
+                  <m:r>
+                    <w:rPr>
+                      <w:rFonts w:ascii="Cambria Math" w:eastAsiaTheme="minorEastAsia" w:hAnsi="Cambria Math"/>
+                    </w:rPr>
+                    <m:t>I</m:t>
+                  </m:r>
+                </m:e>
+                <m:sub>
+                  <m:r>
+                    <w:rPr>
+                      <w:rFonts w:ascii="Cambria Math" w:eastAsiaTheme="minorEastAsia" w:hAnsi="Cambria Math"/>
+                    </w:rPr>
+                    <m:t>2,rms</m:t>
+                  </m:r>
+                </m:sub>
+                <m:sup/>
+              </m:sSubSup>
+            </m:e>
+          </m:rad>
+          <m:r>
+            <w:rPr>
+              <w:rFonts w:ascii="Cambria Math" w:eastAsiaTheme="minorEastAsia" w:hAnsi="Cambria Math"/>
+            </w:rPr>
+            <m:t>=</m:t>
+          </m:r>
+          <m:rad>
+            <m:radPr>
+              <m:degHide m:val="1"/>
+              <m:ctrlPr>
+                <w:rPr>
+                  <w:rFonts w:ascii="Cambria Math" w:eastAsiaTheme="minorEastAsia" w:hAnsi="Cambria Math"/>
+                  <w:i/>
+                </w:rPr>
+              </m:ctrlPr>
+            </m:radPr>
+            <m:deg/>
+            <m:e>
+              <m:sSup>
+                <m:sSupPr>
+                  <m:ctrlPr>
+                    <w:rPr>
+                      <w:rFonts w:ascii="Cambria Math" w:eastAsiaTheme="minorEastAsia" w:hAnsi="Cambria Math"/>
+                      <w:i/>
+                    </w:rPr>
+                  </m:ctrlPr>
+                </m:sSupPr>
+                <m:e>
+                  <m:r>
+                    <w:rPr>
+                      <w:rFonts w:ascii="Cambria Math" w:eastAsiaTheme="minorEastAsia" w:hAnsi="Cambria Math"/>
+                    </w:rPr>
+                    <m:t>3</m:t>
+                  </m:r>
+                </m:e>
+                <m:sup>
+                  <m:r>
+                    <w:rPr>
+                      <w:rFonts w:ascii="Cambria Math" w:eastAsiaTheme="minorEastAsia" w:hAnsi="Cambria Math"/>
+                    </w:rPr>
+                    <m:t>2</m:t>
+                  </m:r>
+                </m:sup>
+              </m:sSup>
+              <m:r>
+                <w:rPr>
+                  <w:rFonts w:ascii="Cambria Math" w:eastAsiaTheme="minorEastAsia" w:hAnsi="Cambria Math"/>
+                </w:rPr>
+                <m:t>+</m:t>
+              </m:r>
+              <m:sSup>
+                <m:sSupPr>
+                  <m:ctrlPr>
+                    <w:rPr>
+                      <w:rFonts w:ascii="Cambria Math" w:eastAsiaTheme="minorEastAsia" w:hAnsi="Cambria Math"/>
+                      <w:i/>
+                    </w:rPr>
+                  </m:ctrlPr>
+                </m:sSupPr>
+                <m:e>
+                  <m:r>
+                    <w:rPr>
+                      <w:rFonts w:ascii="Cambria Math" w:eastAsiaTheme="minorEastAsia" w:hAnsi="Cambria Math"/>
+                    </w:rPr>
+                    <m:t>2.828</m:t>
+                  </m:r>
+                </m:e>
+                <m:sup>
+                  <m:r>
+                    <w:rPr>
+                      <w:rFonts w:ascii="Cambria Math" w:eastAsiaTheme="minorEastAsia" w:hAnsi="Cambria Math"/>
+                    </w:rPr>
+                    <m:t>2</m:t>
+                  </m:r>
+                </m:sup>
+              </m:sSup>
+              <m:r>
+                <w:rPr>
+                  <w:rFonts w:ascii="Cambria Math" w:eastAsiaTheme="minorEastAsia" w:hAnsi="Cambria Math"/>
+                </w:rPr>
+                <m:t>+</m:t>
+              </m:r>
+              <m:sSup>
+                <m:sSupPr>
+                  <m:ctrlPr>
+                    <w:rPr>
+                      <w:rFonts w:ascii="Cambria Math" w:eastAsiaTheme="minorEastAsia" w:hAnsi="Cambria Math"/>
+                      <w:i/>
+                    </w:rPr>
+                  </m:ctrlPr>
+                </m:sSupPr>
+                <m:e>
+                  <m:r>
+                    <w:rPr>
+                      <w:rFonts w:ascii="Cambria Math" w:eastAsiaTheme="minorEastAsia" w:hAnsi="Cambria Math"/>
+                    </w:rPr>
+                    <m:t>4.242</m:t>
+                  </m:r>
+                </m:e>
+                <m:sup>
+                  <m:r>
+                    <w:rPr>
+                      <w:rFonts w:ascii="Cambria Math" w:eastAsiaTheme="minorEastAsia" w:hAnsi="Cambria Math"/>
+                    </w:rPr>
+                    <m:t>2</m:t>
+                  </m:r>
+                </m:sup>
+              </m:sSup>
+            </m:e>
+          </m:rad>
+          <m:r>
+            <w:rPr>
+              <w:rFonts w:ascii="Cambria Math" w:eastAsiaTheme="minorEastAsia" w:hAnsi="Cambria Math"/>
+            </w:rPr>
+            <m:t>=5.92A</m:t>
+          </m:r>
+          <m:r>
+            <w:rPr>
+              <w:rFonts w:eastAsiaTheme="minorEastAsia"/>
+            </w:rPr>
+            <w:br/>
+          </m:r>
+          <m:r>
+            <w:rPr>
+              <w:rFonts w:eastAsiaTheme="minorEastAsia"/>
+            </w:rPr>
+            <w:br/>
+          </m:r>
+        </m:oMath>
+      </m:oMathPara>
+      <w:r>
+        <w:t>To find the RMS values we are able to use a square block, clock block (to get T), integrator block and square root block and applying the following equations.</w:t>
+      </w:r>
+    </w:p>
+    <w:p/>
+    <w:p>
+      <w:pPr>
+        <w:rPr>
+          <w:rFonts w:eastAsiaTheme="minorEastAsia"/>
+        </w:rPr>
+      </w:pPr>
+      <m:oMathPara>
+        <m:oMath>
+          <m:sSub>
+            <m:sSubPr>
+              <m:ctrlPr>
+                <w:rPr>
+                  <w:rFonts w:ascii="Cambria Math" w:hAnsi="Cambria Math"/>
+                  <w:i/>
+                </w:rPr>
+              </m:ctrlPr>
+            </m:sSubPr>
+            <m:e>
+              <m:r>
+                <w:rPr>
+                  <w:rFonts w:ascii="Cambria Math" w:hAnsi="Cambria Math"/>
+                </w:rPr>
+                <m:t>V</m:t>
+              </m:r>
+            </m:e>
+            <m:sub>
+              <m:r>
+                <w:rPr>
+                  <w:rFonts w:ascii="Cambria Math" w:hAnsi="Cambria Math"/>
+                </w:rPr>
+                <m:t>rms</m:t>
+              </m:r>
+            </m:sub>
+          </m:sSub>
+          <m:r>
+            <w:rPr>
+              <w:rFonts w:ascii="Cambria Math" w:hAnsi="Cambria Math"/>
+            </w:rPr>
+            <m:t xml:space="preserve">= </m:t>
+          </m:r>
+          <m:rad>
+            <m:radPr>
+              <m:degHide m:val="1"/>
+              <m:ctrlPr>
+                <w:rPr>
+                  <w:rFonts w:ascii="Cambria Math" w:hAnsi="Cambria Math"/>
+                  <w:i/>
+                </w:rPr>
+              </m:ctrlPr>
+            </m:radPr>
+            <m:deg/>
+            <m:e>
+              <m:f>
+                <m:fPr>
+                  <m:ctrlPr>
+                    <w:rPr>
+                      <w:rFonts w:ascii="Cambria Math" w:hAnsi="Cambria Math"/>
+                      <w:i/>
+                    </w:rPr>
+                  </m:ctrlPr>
+                </m:fPr>
+                <m:num>
+                  <m:r>
+                    <w:rPr>
+                      <w:rFonts w:ascii="Cambria Math" w:hAnsi="Cambria Math"/>
+                    </w:rPr>
+                    <m:t>1</m:t>
+                  </m:r>
+                </m:num>
+                <m:den>
+                  <m:r>
+                    <w:rPr>
+                      <w:rFonts w:ascii="Cambria Math" w:hAnsi="Cambria Math"/>
+                    </w:rPr>
+                    <m:t>T</m:t>
+                  </m:r>
+                </m:den>
+              </m:f>
+              <m:nary>
+                <m:naryPr>
+                  <m:limLoc m:val="subSup"/>
+                  <m:ctrlPr>
+                    <w:rPr>
+                      <w:rFonts w:ascii="Cambria Math" w:hAnsi="Cambria Math"/>
+                      <w:i/>
+                    </w:rPr>
+                  </m:ctrlPr>
+                </m:naryPr>
+                <m:sub>
+                  <m:r>
+                    <w:rPr>
+                      <w:rFonts w:ascii="Cambria Math" w:hAnsi="Cambria Math"/>
+                    </w:rPr>
+                    <m:t>0</m:t>
+                  </m:r>
+                </m:sub>
+                <m:sup>
+                  <m:r>
+                    <w:rPr>
+                      <w:rFonts w:ascii="Cambria Math" w:hAnsi="Cambria Math"/>
+                    </w:rPr>
+                    <m:t>T</m:t>
+                  </m:r>
+                </m:sup>
+                <m:e>
+                  <m:sSup>
+                    <m:sSupPr>
+                      <m:ctrlPr>
+                        <w:rPr>
+                          <w:rFonts w:ascii="Cambria Math" w:hAnsi="Cambria Math"/>
+                          <w:i/>
+                        </w:rPr>
+                      </m:ctrlPr>
+                    </m:sSupPr>
+                    <m:e>
+                      <m:r>
+                        <w:rPr>
+                          <w:rFonts w:ascii="Cambria Math" w:hAnsi="Cambria Math"/>
+                        </w:rPr>
+                        <m:t>v</m:t>
+                      </m:r>
+                    </m:e>
+                    <m:sup>
+                      <m:r>
+                        <w:rPr>
+                          <w:rFonts w:ascii="Cambria Math" w:hAnsi="Cambria Math"/>
+                        </w:rPr>
+                        <m:t>2</m:t>
+                      </m:r>
+                    </m:sup>
+                  </m:sSup>
+                  <m:d>
+                    <m:dPr>
+                      <m:ctrlPr>
+                        <w:rPr>
+                          <w:rFonts w:ascii="Cambria Math" w:hAnsi="Cambria Math"/>
+                          <w:i/>
+                        </w:rPr>
+                      </m:ctrlPr>
+                    </m:dPr>
+                    <m:e>
+                      <m:r>
+                        <w:rPr>
+                          <w:rFonts w:ascii="Cambria Math" w:hAnsi="Cambria Math"/>
+                        </w:rPr>
+                        <m:t>t</m:t>
+                      </m:r>
+                    </m:e>
+                  </m:d>
+                  <m:r>
+                    <w:rPr>
+                      <w:rFonts w:ascii="Cambria Math" w:hAnsi="Cambria Math"/>
+                    </w:rPr>
+                    <m:t>dt</m:t>
+                  </m:r>
+                </m:e>
+              </m:nary>
+            </m:e>
+          </m:rad>
+          <m:r>
+            <w:rPr>
+              <w:rFonts w:eastAsiaTheme="minorEastAsia"/>
+            </w:rPr>
+            <w:br/>
+          </m:r>
+        </m:oMath>
+        <m:oMath>
+          <m:sSub>
+            <m:sSubPr>
+              <m:ctrlPr>
+                <w:rPr>
+                  <w:rFonts w:ascii="Cambria Math" w:hAnsi="Cambria Math"/>
+                  <w:i/>
+                </w:rPr>
+              </m:ctrlPr>
+            </m:sSubPr>
+            <m:e>
+              <m:r>
+                <w:rPr>
+                  <w:rFonts w:ascii="Cambria Math" w:hAnsi="Cambria Math"/>
+                </w:rPr>
+                <m:t>I</m:t>
+              </m:r>
+            </m:e>
+            <m:sub>
+              <m:r>
+                <w:rPr>
+                  <w:rFonts w:ascii="Cambria Math" w:hAnsi="Cambria Math"/>
+                </w:rPr>
+                <m:t>rms</m:t>
+              </m:r>
+            </m:sub>
+          </m:sSub>
+          <m:r>
+            <w:rPr>
+              <w:rFonts w:ascii="Cambria Math" w:hAnsi="Cambria Math"/>
+            </w:rPr>
+            <m:t xml:space="preserve">= </m:t>
+          </m:r>
+          <m:rad>
+            <m:radPr>
+              <m:degHide m:val="1"/>
+              <m:ctrlPr>
+                <w:rPr>
+                  <w:rFonts w:ascii="Cambria Math" w:hAnsi="Cambria Math"/>
+                  <w:i/>
+                </w:rPr>
+              </m:ctrlPr>
+            </m:radPr>
+            <m:deg/>
+            <m:e>
+              <m:f>
+                <m:fPr>
+                  <m:ctrlPr>
+                    <w:rPr>
+                      <w:rFonts w:ascii="Cambria Math" w:hAnsi="Cambria Math"/>
+                      <w:i/>
+                    </w:rPr>
+                  </m:ctrlPr>
+                </m:fPr>
+                <m:num>
+                  <m:r>
+                    <w:rPr>
+                      <w:rFonts w:ascii="Cambria Math" w:hAnsi="Cambria Math"/>
+                    </w:rPr>
+                    <m:t>1</m:t>
+                  </m:r>
+                </m:num>
+                <m:den>
+                  <m:r>
+                    <w:rPr>
+                      <w:rFonts w:ascii="Cambria Math" w:hAnsi="Cambria Math"/>
+                    </w:rPr>
+                    <m:t>T</m:t>
+                  </m:r>
+                </m:den>
+              </m:f>
+              <m:nary>
+                <m:naryPr>
+                  <m:limLoc m:val="subSup"/>
+                  <m:ctrlPr>
+                    <w:rPr>
+                      <w:rFonts w:ascii="Cambria Math" w:hAnsi="Cambria Math"/>
+                      <w:i/>
+                    </w:rPr>
+                  </m:ctrlPr>
+                </m:naryPr>
+                <m:sub>
+                  <m:r>
+                    <w:rPr>
+                      <w:rFonts w:ascii="Cambria Math" w:hAnsi="Cambria Math"/>
+                    </w:rPr>
+                    <m:t>0</m:t>
+                  </m:r>
+                </m:sub>
+                <m:sup>
+                  <m:r>
+                    <w:rPr>
+                      <w:rFonts w:ascii="Cambria Math" w:hAnsi="Cambria Math"/>
+                    </w:rPr>
+                    <m:t>T</m:t>
+                  </m:r>
+                </m:sup>
+                <m:e>
+                  <m:sSup>
+                    <m:sSupPr>
+                      <m:ctrlPr>
+                        <w:rPr>
+                          <w:rFonts w:ascii="Cambria Math" w:hAnsi="Cambria Math"/>
+                          <w:i/>
+                        </w:rPr>
+                      </m:ctrlPr>
+                    </m:sSupPr>
+                    <m:e>
+                      <m:r>
+                        <w:rPr>
+                          <w:rFonts w:ascii="Cambria Math" w:hAnsi="Cambria Math"/>
+                        </w:rPr>
+                        <m:t>i</m:t>
+                      </m:r>
+                    </m:e>
+                    <m:sup>
+                      <m:r>
+                        <w:rPr>
+                          <w:rFonts w:ascii="Cambria Math" w:hAnsi="Cambria Math"/>
+                        </w:rPr>
+                        <m:t>2</m:t>
+                      </m:r>
+                    </m:sup>
+                  </m:sSup>
+                  <m:d>
+                    <m:dPr>
+                      <m:ctrlPr>
+                        <w:rPr>
+                          <w:rFonts w:ascii="Cambria Math" w:hAnsi="Cambria Math"/>
+                          <w:i/>
+                        </w:rPr>
+                      </m:ctrlPr>
+                    </m:dPr>
+                    <m:e>
+                      <m:r>
+                        <w:rPr>
+                          <w:rFonts w:ascii="Cambria Math" w:hAnsi="Cambria Math"/>
+                        </w:rPr>
+                        <m:t>t</m:t>
+                      </m:r>
+                    </m:e>
+                  </m:d>
+                  <m:r>
+                    <w:rPr>
+                      <w:rFonts w:ascii="Cambria Math" w:hAnsi="Cambria Math"/>
+                    </w:rPr>
+                    <m:t>dt</m:t>
+                  </m:r>
+                </m:e>
+              </m:nary>
+            </m:e>
+          </m:rad>
+        </m:oMath>
+      </m:oMathPara>
+    </w:p>
+    <w:p>
+      <w:proofErr w:type="gramStart"/>
+      <w:r>
+        <w:rPr>
+          <w:rFonts w:eastAsiaTheme="minorEastAsia"/>
+        </w:rPr>
+        <w:t>Alternatively</w:t>
+      </w:r>
+      <w:proofErr w:type="gramEnd"/>
+      <w:r>
+        <w:rPr>
+          <w:rFonts w:eastAsiaTheme="minorEastAsia"/>
+        </w:rPr>
+        <w:t xml:space="preserve"> MATLAB also offers an RMS block which can calculate the RMS value for you.</w:t>
+      </w:r>
+      <m:oMath>
+        <m:r>
+          <w:rPr>
+            <w:rFonts w:ascii="Cambria Math" w:eastAsiaTheme="minorEastAsia" w:hAnsi="Cambria Math"/>
+          </w:rPr>
+          <w:br/>
+        </m:r>
+      </m:oMath>
+      <w:r>
+        <w:drawing>
+          <wp:inline distT="0" distB="0" distL="0" distR="0" wp14:anchorId="2013BF20" wp14:editId="19AB30B2">
+            <wp:extent cx="1926893" cy="809625"/>
+            <wp:effectExtent l="0" t="0" r="0" b="0"/>
+            <wp:docPr id="12" name="Picture 12"/>
+            <wp:cNvGraphicFramePr>
+              <a:graphicFrameLocks xmlns:a="http://schemas.openxmlformats.org/drawingml/2006/main" noChangeAspect="1"/>
+            </wp:cNvGraphicFramePr>
+            <a:graphic xmlns:a="http://schemas.openxmlformats.org/drawingml/2006/main">
+              <a:graphicData uri="http://schemas.openxmlformats.org/drawingml/2006/picture">
+                <pic:pic xmlns:pic="http://schemas.openxmlformats.org/drawingml/2006/picture">
+                  <pic:nvPicPr>
+                    <pic:cNvPr id="1" name=""/>
+                    <pic:cNvPicPr/>
+                  </pic:nvPicPr>
+                  <pic:blipFill rotWithShape="1">
+                    <a:blip r:embed="rId10"/>
+                    <a:srcRect l="31191"/>
+                    <a:stretch/>
+                  </pic:blipFill>
+                  <pic:spPr bwMode="auto">
+                    <a:xfrm>
+                      <a:off x="0" y="0"/>
+                      <a:ext cx="1927162" cy="809738"/>
+                    </a:xfrm>
+                    <a:prstGeom prst="rect">
+                      <a:avLst/>
+                    </a:prstGeom>
+                    <a:ln>
+                      <a:noFill/>
+                    </a:ln>
+                    <a:extLst>
+                      <a:ext uri="{53640926-AAD7-44D8-BBD7-CCE9431645EC}">
+                        <a14:shadowObscured xmlns:a14="http://schemas.microsoft.com/office/drawing/2010/main"/>
+                      </a:ext>
+                    </a:extLst>
+                  </pic:spPr>
+                </pic:pic>
+              </a:graphicData>
+            </a:graphic>
+          </wp:inline>
+        </w:drawing>
+      </w:r>
+    </w:p>
+    <w:p>
+      <w:pPr>
+        <w:pStyle w:val="Caption"/>
+      </w:pPr>
+      <w:r>
+        <w:t xml:space="preserve">Figure </w:t>
+      </w:r>
+      <w:r>
+        <w:fldChar w:fldCharType="begin"/>
+      </w:r>
+      <w:r>
+        <w:instrText xml:space="preserve"> SEQ Figure \* ARABIC </w:instrText>
+      </w:r>
+      <w:r>
+        <w:fldChar w:fldCharType="separate"/>
+      </w:r>
+      <w:r>
+        <w:rPr>
+          <w:noProof/>
+        </w:rPr>
+        <w:t>5</w:t>
+      </w:r>
+      <w:r>
+        <w:fldChar w:fldCharType="end"/>
+      </w:r>
+      <w:r>
+        <w:t xml:space="preserve"> RMS current form simulation</w:t>
+      </w:r>
+    </w:p>
+    <w:p>
+      <w:pPr>
+        <w:keepNext/>
+      </w:pPr>
+      <w:r>
+        <w:lastRenderedPageBreak/>
+        <w:drawing>
+          <wp:inline distT="0" distB="0" distL="0" distR="0" wp14:anchorId="1E53B81E" wp14:editId="0CCB279A">
+            <wp:extent cx="1438476" cy="800212"/>
+            <wp:effectExtent l="0" t="0" r="9525" b="0"/>
+            <wp:docPr id="13" name="Picture 13"/>
+            <wp:cNvGraphicFramePr>
+              <a:graphicFrameLocks xmlns:a="http://schemas.openxmlformats.org/drawingml/2006/main" noChangeAspect="1"/>
+            </wp:cNvGraphicFramePr>
+            <a:graphic xmlns:a="http://schemas.openxmlformats.org/drawingml/2006/main">
+              <a:graphicData uri="http://schemas.openxmlformats.org/drawingml/2006/picture">
+                <pic:pic xmlns:pic="http://schemas.openxmlformats.org/drawingml/2006/picture">
+                  <pic:nvPicPr>
+                    <pic:cNvPr id="1" name=""/>
+                    <pic:cNvPicPr/>
+                  </pic:nvPicPr>
+                  <pic:blipFill>
+                    <a:blip r:embed="rId11"/>
+                    <a:stretch>
+                      <a:fillRect/>
+                    </a:stretch>
+                  </pic:blipFill>
+                  <pic:spPr>
+                    <a:xfrm>
+                      <a:off x="0" y="0"/>
+                      <a:ext cx="1438476" cy="800212"/>
+                    </a:xfrm>
+                    <a:prstGeom prst="rect">
+                      <a:avLst/>
+                    </a:prstGeom>
+                  </pic:spPr>
+                </pic:pic>
+              </a:graphicData>
+            </a:graphic>
+          </wp:inline>
+        </w:drawing>
+      </w:r>
+    </w:p>
+    <w:p>
+      <w:pPr>
+        <w:pStyle w:val="Caption"/>
+      </w:pPr>
+      <w:r>
+        <w:t xml:space="preserve">Figure </w:t>
+      </w:r>
+      <w:r>
+        <w:fldChar w:fldCharType="begin"/>
+      </w:r>
+      <w:r>
+        <w:instrText xml:space="preserve"> SEQ Figure \* ARABIC </w:instrText>
+      </w:r>
+      <w:r>
+        <w:fldChar w:fldCharType="separate"/>
+      </w:r>
+      <w:r>
+        <w:rPr>
+          <w:noProof/>
+        </w:rPr>
+        <w:t>6</w:t>
+      </w:r>
+      <w:r>
+        <w:fldChar w:fldCharType="end"/>
+      </w:r>
+      <w:r>
+        <w:t xml:space="preserve"> RMS voltage form simulation</w:t>
+      </w:r>
+    </w:p>
+    <w:p>
+      <w:r>
+        <w:t>We can see that the measured RMS values seen in figure 6 and 7 are in line with the calculated values for MRS voltage and current.</w:t>
+      </w:r>
+    </w:p>
+    <w:p/>
+    <w:p>
+      <w:r>
+        <w:t xml:space="preserve">In order to find the power </w:t>
+      </w:r>
+      <w:r>
+        <w:t>factor,</w:t>
+      </w:r>
+      <w:r>
+        <w:t xml:space="preserve"> we will make use of the following formula:</w:t>
+      </w:r>
+    </w:p>
+    <w:p>
+      <w:pPr>
+        <w:jc w:val="center"/>
+        <w:rPr>
+          <w:rFonts w:eastAsiaTheme="minorEastAsia"/>
+        </w:rPr>
+      </w:pPr>
+      <m:oMathPara>
+        <m:oMath>
+          <m:r>
+            <w:rPr>
+              <w:rFonts w:ascii="Cambria Math" w:hAnsi="Cambria Math"/>
+            </w:rPr>
+            <m:t xml:space="preserve">PF= </m:t>
+          </m:r>
+          <m:f>
+            <m:fPr>
+              <m:ctrlPr>
+                <w:rPr>
+                  <w:rFonts w:ascii="Cambria Math" w:hAnsi="Cambria Math"/>
+                  <w:i/>
+                </w:rPr>
+              </m:ctrlPr>
+            </m:fPr>
+            <m:num>
+              <m:r>
+                <w:rPr>
+                  <w:rFonts w:ascii="Cambria Math" w:hAnsi="Cambria Math"/>
+                </w:rPr>
+                <m:t>P</m:t>
+              </m:r>
+            </m:num>
+            <m:den>
+              <m:sSub>
+                <m:sSubPr>
+                  <m:ctrlPr>
+                    <w:rPr>
+                      <w:rFonts w:ascii="Cambria Math" w:hAnsi="Cambria Math"/>
+                      <w:i/>
+                    </w:rPr>
+                  </m:ctrlPr>
+                </m:sSubPr>
+                <m:e>
+                  <m:r>
+                    <w:rPr>
+                      <w:rFonts w:ascii="Cambria Math" w:hAnsi="Cambria Math"/>
+                    </w:rPr>
+                    <m:t>V</m:t>
+                  </m:r>
+                </m:e>
+                <m:sub>
+                  <m:r>
+                    <w:rPr>
+                      <w:rFonts w:ascii="Cambria Math" w:hAnsi="Cambria Math"/>
+                    </w:rPr>
+                    <m:t>rms</m:t>
+                  </m:r>
+                </m:sub>
+              </m:sSub>
+              <m:sSub>
+                <m:sSubPr>
+                  <m:ctrlPr>
+                    <w:rPr>
+                      <w:rFonts w:ascii="Cambria Math" w:hAnsi="Cambria Math"/>
+                      <w:i/>
+                    </w:rPr>
+                  </m:ctrlPr>
+                </m:sSubPr>
+                <m:e>
+                  <m:r>
+                    <w:rPr>
+                      <w:rFonts w:ascii="Cambria Math" w:hAnsi="Cambria Math"/>
+                    </w:rPr>
+                    <m:t>I</m:t>
+                  </m:r>
+                </m:e>
+                <m:sub>
+                  <m:r>
+                    <w:rPr>
+                      <w:rFonts w:ascii="Cambria Math" w:hAnsi="Cambria Math"/>
+                    </w:rPr>
+                    <m:t>rms</m:t>
+                  </m:r>
+                </m:sub>
+              </m:sSub>
+            </m:den>
+          </m:f>
+        </m:oMath>
+      </m:oMathPara>
+    </w:p>
+    <w:p>
+      <w:pPr>
+        <w:keepNext/>
+        <w:jc w:val="center"/>
+        <w:rPr>
+          <w:rFonts w:eastAsiaTheme="minorEastAsia"/>
+        </w:rPr>
+      </w:pPr>
+      <m:oMathPara>
+        <m:oMath>
+          <m:r>
+            <w:rPr>
+              <w:rFonts w:ascii="Cambria Math" w:hAnsi="Cambria Math"/>
+            </w:rPr>
+            <m:t xml:space="preserve">PF= </m:t>
+          </m:r>
+          <m:f>
+            <m:fPr>
+              <m:ctrlPr>
+                <w:rPr>
+                  <w:rFonts w:ascii="Cambria Math" w:hAnsi="Cambria Math"/>
+                  <w:i/>
+                </w:rPr>
+              </m:ctrlPr>
+            </m:fPr>
+            <m:num>
+              <m:r>
+                <w:rPr>
+                  <w:rFonts w:ascii="Cambria Math" w:hAnsi="Cambria Math"/>
+                </w:rPr>
+                <m:t>1194</m:t>
+              </m:r>
+            </m:num>
+            <m:den>
+              <m:r>
+                <w:rPr>
+                  <w:rFonts w:ascii="Cambria Math" w:hAnsi="Cambria Math"/>
+                </w:rPr>
+                <m:t>345.5*5.92</m:t>
+              </m:r>
+            </m:den>
+          </m:f>
+          <m:r>
+            <w:rPr>
+              <w:rFonts w:ascii="Cambria Math" w:eastAsiaTheme="minorEastAsia" w:hAnsi="Cambria Math"/>
+            </w:rPr>
+            <m:t>=0.584</m:t>
+          </m:r>
+        </m:oMath>
+      </m:oMathPara>
+    </w:p>
+    <w:p>
+      <w:pPr>
+        <w:keepNext/>
+        <w:jc w:val="center"/>
+        <w:rPr>
+          <w:rFonts w:eastAsiaTheme="minorEastAsia"/>
+        </w:rPr>
+      </w:pPr>
+    </w:p>
+    <w:p>
+      <w:pPr>
+        <w:keepNext/>
+      </w:pPr>
+      <w:r>
+        <w:rPr>
+          <w:rFonts w:eastAsiaTheme="minorEastAsia"/>
+        </w:rPr>
+        <w:t xml:space="preserve">To find the PF in simulation we take the RMS volt and current and input them to product block which we then feed in to a divide block along with the average power </w:t>
+      </w:r>
+      <w:r>
+        <w:rPr>
+          <w:rFonts w:eastAsiaTheme="minorEastAsia"/>
+        </w:rPr>
+        <w:br/>
+      </w:r>
+      <w:r>
+        <w:drawing>
+          <wp:inline distT="0" distB="0" distL="0" distR="0" wp14:anchorId="41911875" wp14:editId="76640D74">
+            <wp:extent cx="2152950" cy="1114581"/>
+            <wp:effectExtent l="0" t="0" r="0" b="9525"/>
+            <wp:docPr id="14" name="Picture 14"/>
+            <wp:cNvGraphicFramePr>
+              <a:graphicFrameLocks xmlns:a="http://schemas.openxmlformats.org/drawingml/2006/main" noChangeAspect="1"/>
+            </wp:cNvGraphicFramePr>
+            <a:graphic xmlns:a="http://schemas.openxmlformats.org/drawingml/2006/main">
+              <a:graphicData uri="http://schemas.openxmlformats.org/drawingml/2006/picture">
+                <pic:pic xmlns:pic="http://schemas.openxmlformats.org/drawingml/2006/picture">
+                  <pic:nvPicPr>
+                    <pic:cNvPr id="1" name=""/>
+                    <pic:cNvPicPr/>
+                  </pic:nvPicPr>
+                  <pic:blipFill>
+                    <a:blip r:embed="rId12"/>
+                    <a:stretch>
+                      <a:fillRect/>
+                    </a:stretch>
+                  </pic:blipFill>
+                  <pic:spPr>
+                    <a:xfrm>
+                      <a:off x="0" y="0"/>
+                      <a:ext cx="2152950" cy="1114581"/>
+                    </a:xfrm>
+                    <a:prstGeom prst="rect">
+                      <a:avLst/>
+                    </a:prstGeom>
+                  </pic:spPr>
+                </pic:pic>
+              </a:graphicData>
+            </a:graphic>
+          </wp:inline>
+        </w:drawing>
+      </w:r>
+    </w:p>
+    <w:p>
+      <w:pPr>
+        <w:pStyle w:val="Caption"/>
+        <w:jc w:val="center"/>
+      </w:pPr>
+      <w:r>
+        <w:t xml:space="preserve">Figure </w:t>
+      </w:r>
+      <w:r>
+        <w:fldChar w:fldCharType="begin"/>
+      </w:r>
+      <w:r>
+        <w:instrText xml:space="preserve"> SEQ Figure \* ARABIC </w:instrText>
+      </w:r>
+      <w:r>
+        <w:fldChar w:fldCharType="separate"/>
+      </w:r>
+      <w:r>
+        <w:rPr>
+          <w:noProof/>
+        </w:rPr>
+        <w:t>7</w:t>
+      </w:r>
+      <w:r>
+        <w:fldChar w:fldCharType="end"/>
+      </w:r>
+      <w:r>
+        <w:t xml:space="preserve"> power factor determined in simulation</w:t>
+      </w:r>
+    </w:p>
+    <w:p>
+      <w:r>
+        <w:t>As we can see the simulated value for PF closely matches the calculated value.</w:t>
+      </w:r>
+    </w:p>
+    <w:p/>
+    <w:p/>
+    <w:p/>
+    <w:p/>
+    <w:p/>
+    <w:p/>
+    <w:p/>
+    <w:p/>
+    <w:p/>
+    <w:p>
+      <w:pPr>
+        <w:pStyle w:val="Heading2"/>
+      </w:pPr>
+      <w:r>
+        <w:lastRenderedPageBreak/>
+        <w:t xml:space="preserve">Question 2 </w:t>
+      </w:r>
+    </w:p>
     <w:p/>
     <w:sectPr>
       <w:pgSz w:w="11906" w:h="16838"/>

</xml_diff>

<commit_message>
complted question 2 for 3091 proj b
</commit_message>
<xml_diff>
--- a/EEE3091/Power electronics project part b.docx
+++ b/EEE3091/Power electronics project part b.docx
@@ -75,37 +75,15 @@
           <w:b/>
           <w:bCs/>
         </w:rPr>
-        <w:t xml:space="preserve">Prepared </w:t>
-      </w:r>
-      <w:proofErr w:type="gramStart"/>
-      <w:r>
-        <w:rPr>
-          <w:b/>
-          <w:bCs/>
-        </w:rPr>
-        <w:t>by :</w:t>
-      </w:r>
-      <w:proofErr w:type="gramEnd"/>
+        <w:t>Prepared by :</w:t>
+      </w:r>
     </w:p>
     <w:p>
       <w:pPr>
         <w:jc w:val="center"/>
       </w:pPr>
-      <w:proofErr w:type="spellStart"/>
-      <w:r>
-        <w:t>Tadala</w:t>
-      </w:r>
-      <w:proofErr w:type="spellEnd"/>
-      <w:r>
-        <w:t xml:space="preserve"> </w:t>
-      </w:r>
-      <w:proofErr w:type="spellStart"/>
-      <w:r>
-        <w:t>Mitumbili</w:t>
-      </w:r>
-      <w:proofErr w:type="spellEnd"/>
-      <w:r>
-        <w:t xml:space="preserve"> </w:t>
+      <w:r>
+        <w:t xml:space="preserve">Tadala Mitumbili </w:t>
       </w:r>
     </w:p>
     <w:p>
@@ -121,17 +99,8 @@
           <w:b/>
           <w:bCs/>
         </w:rPr>
-        <w:t xml:space="preserve">Due </w:t>
-      </w:r>
-      <w:proofErr w:type="gramStart"/>
-      <w:r>
-        <w:rPr>
-          <w:b/>
-          <w:bCs/>
-        </w:rPr>
-        <w:t>Date :</w:t>
-      </w:r>
-      <w:proofErr w:type="gramEnd"/>
+        <w:t>Due Date :</w:t>
+      </w:r>
     </w:p>
     <w:p>
       <w:pPr>
@@ -323,7 +292,6 @@
       </w:r>
     </w:p>
     <w:p>
-      <w:proofErr w:type="gramStart"/>
       <w:r>
         <w:t>V</w:t>
       </w:r>
@@ -334,11 +302,7 @@
         <w:t xml:space="preserve">dc  </w:t>
       </w:r>
       <w:r>
-        <w:t>=</w:t>
-      </w:r>
-      <w:proofErr w:type="gramEnd"/>
-      <w:r>
-        <w:t xml:space="preserve"> 3 x 100 = 300 V</w:t>
+        <w:t>= 3 x 100 = 300 V</w:t>
       </w:r>
     </w:p>
     <w:p>
@@ -735,101 +699,178 @@
           <w:rFonts w:eastAsiaTheme="minorEastAsia"/>
         </w:rPr>
       </w:pPr>
-      <m:oMathPara>
-        <m:oMath>
-          <m:sSub>
-            <m:sSubPr>
-              <m:ctrlPr>
-                <w:rPr>
-                  <w:rFonts w:ascii="Cambria Math" w:eastAsiaTheme="minorEastAsia" w:hAnsi="Cambria Math"/>
-                  <w:i/>
-                </w:rPr>
-              </m:ctrlPr>
-            </m:sSubPr>
-            <m:e>
-              <m:r>
-                <w:rPr>
-                  <w:rFonts w:ascii="Cambria Math" w:eastAsiaTheme="minorEastAsia" w:hAnsi="Cambria Math"/>
-                </w:rPr>
-                <m:t>v</m:t>
-              </m:r>
-            </m:e>
-            <m:sub>
-              <m:r>
-                <w:rPr>
-                  <w:rFonts w:ascii="Cambria Math" w:eastAsiaTheme="minorEastAsia" w:hAnsi="Cambria Math"/>
-                </w:rPr>
-                <m:t>1</m:t>
-              </m:r>
-            </m:sub>
-          </m:sSub>
-          <m:d>
-            <m:dPr>
-              <m:ctrlPr>
-                <w:rPr>
-                  <w:rFonts w:ascii="Cambria Math" w:eastAsiaTheme="minorEastAsia" w:hAnsi="Cambria Math"/>
-                  <w:i/>
-                </w:rPr>
-              </m:ctrlPr>
-            </m:dPr>
-            <m:e>
-              <m:r>
-                <w:rPr>
-                  <w:rFonts w:ascii="Cambria Math" w:eastAsiaTheme="minorEastAsia" w:hAnsi="Cambria Math"/>
-                </w:rPr>
-                <m:t>t</m:t>
-              </m:r>
-            </m:e>
-          </m:d>
-          <m:r>
-            <w:rPr>
-              <w:rFonts w:ascii="Cambria Math" w:eastAsiaTheme="minorEastAsia" w:hAnsi="Cambria Math"/>
-            </w:rPr>
-            <m:t>=187.44</m:t>
-          </m:r>
-          <m:func>
-            <m:funcPr>
-              <m:ctrlPr>
-                <w:rPr>
-                  <w:rFonts w:ascii="Cambria Math" w:eastAsiaTheme="minorEastAsia" w:hAnsi="Cambria Math"/>
-                  <w:i/>
-                </w:rPr>
-              </m:ctrlPr>
-            </m:funcPr>
-            <m:fName>
-              <m:r>
-                <m:rPr>
-                  <m:sty m:val="p"/>
-                </m:rPr>
-                <w:rPr>
-                  <w:rFonts w:ascii="Cambria Math" w:eastAsiaTheme="minorEastAsia" w:hAnsi="Cambria Math"/>
-                </w:rPr>
-                <m:t>cos</m:t>
-              </m:r>
-            </m:fName>
-            <m:e>
-              <m:d>
-                <m:dPr>
-                  <m:ctrlPr>
-                    <w:rPr>
-                      <w:rFonts w:ascii="Cambria Math" w:eastAsiaTheme="minorEastAsia" w:hAnsi="Cambria Math"/>
-                      <w:i/>
-                    </w:rPr>
-                  </m:ctrlPr>
-                </m:dPr>
-                <m:e>
-                  <m:r>
-                    <w:rPr>
-                      <w:rFonts w:ascii="Cambria Math" w:eastAsiaTheme="minorEastAsia" w:hAnsi="Cambria Math"/>
-                    </w:rPr>
-                    <m:t>2π*60t-62.05°</m:t>
-                  </m:r>
-                </m:e>
-              </m:d>
-            </m:e>
-          </m:func>
-        </m:oMath>
-      </m:oMathPara>
+      <m:oMath>
+        <m:sSub>
+          <m:sSubPr>
+            <m:ctrlPr>
+              <w:rPr>
+                <w:rFonts w:ascii="Cambria Math" w:eastAsiaTheme="minorEastAsia" w:hAnsi="Cambria Math"/>
+                <w:i/>
+              </w:rPr>
+            </m:ctrlPr>
+          </m:sSubPr>
+          <m:e>
+            <m:r>
+              <w:rPr>
+                <w:rFonts w:ascii="Cambria Math" w:eastAsiaTheme="minorEastAsia" w:hAnsi="Cambria Math"/>
+              </w:rPr>
+              <m:t>v</m:t>
+            </m:r>
+          </m:e>
+          <m:sub>
+            <m:r>
+              <w:rPr>
+                <w:rFonts w:ascii="Cambria Math" w:eastAsiaTheme="minorEastAsia" w:hAnsi="Cambria Math"/>
+              </w:rPr>
+              <m:t>1</m:t>
+            </m:r>
+          </m:sub>
+        </m:sSub>
+        <m:d>
+          <m:dPr>
+            <m:ctrlPr>
+              <w:rPr>
+                <w:rFonts w:ascii="Cambria Math" w:eastAsiaTheme="minorEastAsia" w:hAnsi="Cambria Math"/>
+                <w:i/>
+              </w:rPr>
+            </m:ctrlPr>
+          </m:dPr>
+          <m:e>
+            <m:r>
+              <w:rPr>
+                <w:rFonts w:ascii="Cambria Math" w:eastAsiaTheme="minorEastAsia" w:hAnsi="Cambria Math"/>
+              </w:rPr>
+              <m:t>t</m:t>
+            </m:r>
+          </m:e>
+        </m:d>
+        <m:r>
+          <w:rPr>
+            <w:rFonts w:ascii="Cambria Math" w:eastAsiaTheme="minorEastAsia" w:hAnsi="Cambria Math"/>
+          </w:rPr>
+          <m:t>=187.44</m:t>
+        </m:r>
+        <m:func>
+          <m:funcPr>
+            <m:ctrlPr>
+              <w:rPr>
+                <w:rFonts w:ascii="Cambria Math" w:eastAsiaTheme="minorEastAsia" w:hAnsi="Cambria Math"/>
+                <w:i/>
+              </w:rPr>
+            </m:ctrlPr>
+          </m:funcPr>
+          <m:fName>
+            <m:r>
+              <m:rPr>
+                <m:sty m:val="p"/>
+              </m:rPr>
+              <w:rPr>
+                <w:rFonts w:ascii="Cambria Math" w:eastAsiaTheme="minorEastAsia" w:hAnsi="Cambria Math"/>
+              </w:rPr>
+              <m:t>cos</m:t>
+            </m:r>
+          </m:fName>
+          <m:e>
+            <m:d>
+              <m:dPr>
+                <m:ctrlPr>
+                  <w:rPr>
+                    <w:rFonts w:ascii="Cambria Math" w:eastAsiaTheme="minorEastAsia" w:hAnsi="Cambria Math"/>
+                    <w:i/>
+                  </w:rPr>
+                </m:ctrlPr>
+              </m:dPr>
+              <m:e>
+                <m:r>
+                  <w:rPr>
+                    <w:rFonts w:ascii="Cambria Math" w:eastAsiaTheme="minorEastAsia" w:hAnsi="Cambria Math"/>
+                  </w:rPr>
+                  <m:t>2π*60t-62.05°</m:t>
+                </m:r>
+              </m:e>
+            </m:d>
+          </m:e>
+        </m:func>
+      </m:oMath>
+      <w:r>
+        <w:rPr>
+          <w:rFonts w:eastAsiaTheme="minorEastAsia"/>
+        </w:rPr>
+        <w:t xml:space="preserve"> =</w:t>
+      </w:r>
+      <m:oMath>
+        <m:r>
+          <w:rPr>
+            <w:rFonts w:ascii="Cambria Math" w:eastAsiaTheme="minorEastAsia" w:hAnsi="Cambria Math"/>
+          </w:rPr>
+          <m:t>187.44</m:t>
+        </m:r>
+        <m:func>
+          <m:funcPr>
+            <m:ctrlPr>
+              <w:rPr>
+                <w:rFonts w:ascii="Cambria Math" w:eastAsiaTheme="minorEastAsia" w:hAnsi="Cambria Math"/>
+                <w:i/>
+              </w:rPr>
+            </m:ctrlPr>
+          </m:funcPr>
+          <m:fName>
+            <m:r>
+              <m:rPr>
+                <m:sty m:val="p"/>
+              </m:rPr>
+              <w:rPr>
+                <w:rFonts w:ascii="Cambria Math" w:hAnsi="Cambria Math"/>
+              </w:rPr>
+              <m:t>sin</m:t>
+            </m:r>
+          </m:fName>
+          <m:e>
+            <m:r>
+              <w:rPr>
+                <w:rFonts w:ascii="Cambria Math" w:eastAsiaTheme="minorEastAsia" w:hAnsi="Cambria Math"/>
+              </w:rPr>
+              <m:t>(</m:t>
+            </m:r>
+            <m:r>
+              <w:rPr>
+                <w:rFonts w:ascii="Cambria Math" w:eastAsiaTheme="minorEastAsia" w:hAnsi="Cambria Math"/>
+              </w:rPr>
+              <m:t>2π*60t-</m:t>
+            </m:r>
+            <m:r>
+              <w:rPr>
+                <w:rFonts w:ascii="Cambria Math" w:eastAsiaTheme="minorEastAsia" w:hAnsi="Cambria Math"/>
+              </w:rPr>
+              <m:t>27.95</m:t>
+            </m:r>
+            <m:r>
+              <w:rPr>
+                <w:rFonts w:ascii="Cambria Math" w:eastAsiaTheme="minorEastAsia" w:hAnsi="Cambria Math"/>
+              </w:rPr>
+              <m:t>°</m:t>
+            </m:r>
+            <m:r>
+              <w:rPr>
+                <w:rFonts w:ascii="Cambria Math" w:eastAsiaTheme="minorEastAsia" w:hAnsi="Cambria Math"/>
+              </w:rPr>
+              <m:t>)</m:t>
+            </m:r>
+          </m:e>
+        </m:func>
+      </m:oMath>
+      <w:r>
+        <w:rPr>
+          <w:rFonts w:eastAsiaTheme="minorEastAsia"/>
+        </w:rPr>
+        <w:t xml:space="preserve"> </w:t>
+      </w:r>
+      <w:r>
+        <w:rPr>
+          <w:rFonts w:eastAsiaTheme="minorEastAsia"/>
+        </w:rPr>
+        <w:t xml:space="preserve">= </w:t>
+      </w:r>
     </w:p>
     <w:p>
       <w:pPr>
@@ -1233,101 +1274,140 @@
           <w:rFonts w:eastAsiaTheme="minorEastAsia"/>
         </w:rPr>
       </w:pPr>
-      <m:oMathPara>
-        <m:oMath>
-          <m:sSub>
-            <m:sSubPr>
-              <m:ctrlPr>
-                <w:rPr>
-                  <w:rFonts w:ascii="Cambria Math" w:eastAsiaTheme="minorEastAsia" w:hAnsi="Cambria Math"/>
-                  <w:i/>
-                </w:rPr>
-              </m:ctrlPr>
-            </m:sSubPr>
-            <m:e>
-              <m:r>
-                <w:rPr>
-                  <w:rFonts w:ascii="Cambria Math" w:eastAsiaTheme="minorEastAsia" w:hAnsi="Cambria Math"/>
-                </w:rPr>
-                <m:t>v</m:t>
-              </m:r>
-            </m:e>
-            <m:sub>
-              <m:r>
-                <w:rPr>
-                  <w:rFonts w:ascii="Cambria Math" w:eastAsiaTheme="minorEastAsia" w:hAnsi="Cambria Math"/>
-                </w:rPr>
-                <m:t>1</m:t>
-              </m:r>
-            </m:sub>
-          </m:sSub>
-          <m:d>
-            <m:dPr>
-              <m:ctrlPr>
-                <w:rPr>
-                  <w:rFonts w:ascii="Cambria Math" w:eastAsiaTheme="minorEastAsia" w:hAnsi="Cambria Math"/>
-                  <w:i/>
-                </w:rPr>
-              </m:ctrlPr>
-            </m:dPr>
-            <m:e>
-              <m:r>
-                <w:rPr>
-                  <w:rFonts w:ascii="Cambria Math" w:eastAsiaTheme="minorEastAsia" w:hAnsi="Cambria Math"/>
-                </w:rPr>
-                <m:t>t</m:t>
-              </m:r>
-            </m:e>
-          </m:d>
-          <m:r>
-            <w:rPr>
-              <w:rFonts w:ascii="Cambria Math" w:eastAsiaTheme="minorEastAsia" w:hAnsi="Cambria Math"/>
-            </w:rPr>
-            <m:t>=153.84</m:t>
-          </m:r>
-          <m:func>
-            <m:funcPr>
-              <m:ctrlPr>
-                <w:rPr>
-                  <w:rFonts w:ascii="Cambria Math" w:eastAsiaTheme="minorEastAsia" w:hAnsi="Cambria Math"/>
-                  <w:i/>
-                </w:rPr>
-              </m:ctrlPr>
-            </m:funcPr>
-            <m:fName>
-              <m:r>
-                <m:rPr>
-                  <m:sty m:val="p"/>
-                </m:rPr>
-                <w:rPr>
-                  <w:rFonts w:ascii="Cambria Math" w:eastAsiaTheme="minorEastAsia" w:hAnsi="Cambria Math"/>
-                </w:rPr>
-                <m:t>cos</m:t>
-              </m:r>
-            </m:fName>
-            <m:e>
-              <m:d>
-                <m:dPr>
-                  <m:ctrlPr>
-                    <w:rPr>
-                      <w:rFonts w:ascii="Cambria Math" w:eastAsiaTheme="minorEastAsia" w:hAnsi="Cambria Math"/>
-                      <w:i/>
-                    </w:rPr>
-                  </m:ctrlPr>
-                </m:dPr>
-                <m:e>
-                  <m:r>
-                    <w:rPr>
-                      <w:rFonts w:ascii="Cambria Math" w:eastAsiaTheme="minorEastAsia" w:hAnsi="Cambria Math"/>
-                    </w:rPr>
-                    <m:t>2π*60t-75.14°</m:t>
-                  </m:r>
-                </m:e>
-              </m:d>
-            </m:e>
-          </m:func>
-        </m:oMath>
-      </m:oMathPara>
+      <m:oMath>
+        <m:sSub>
+          <m:sSubPr>
+            <m:ctrlPr>
+              <w:rPr>
+                <w:rFonts w:ascii="Cambria Math" w:eastAsiaTheme="minorEastAsia" w:hAnsi="Cambria Math"/>
+                <w:i/>
+              </w:rPr>
+            </m:ctrlPr>
+          </m:sSubPr>
+          <m:e>
+            <m:r>
+              <w:rPr>
+                <w:rFonts w:ascii="Cambria Math" w:eastAsiaTheme="minorEastAsia" w:hAnsi="Cambria Math"/>
+              </w:rPr>
+              <m:t>v</m:t>
+            </m:r>
+          </m:e>
+          <m:sub>
+            <m:r>
+              <w:rPr>
+                <w:rFonts w:ascii="Cambria Math" w:eastAsiaTheme="minorEastAsia" w:hAnsi="Cambria Math"/>
+              </w:rPr>
+              <m:t>1</m:t>
+            </m:r>
+          </m:sub>
+        </m:sSub>
+        <m:d>
+          <m:dPr>
+            <m:ctrlPr>
+              <w:rPr>
+                <w:rFonts w:ascii="Cambria Math" w:eastAsiaTheme="minorEastAsia" w:hAnsi="Cambria Math"/>
+                <w:i/>
+              </w:rPr>
+            </m:ctrlPr>
+          </m:dPr>
+          <m:e>
+            <m:r>
+              <w:rPr>
+                <w:rFonts w:ascii="Cambria Math" w:eastAsiaTheme="minorEastAsia" w:hAnsi="Cambria Math"/>
+              </w:rPr>
+              <m:t>t</m:t>
+            </m:r>
+          </m:e>
+        </m:d>
+        <m:r>
+          <w:rPr>
+            <w:rFonts w:ascii="Cambria Math" w:eastAsiaTheme="minorEastAsia" w:hAnsi="Cambria Math"/>
+          </w:rPr>
+          <m:t>=153.84</m:t>
+        </m:r>
+        <m:func>
+          <m:funcPr>
+            <m:ctrlPr>
+              <w:rPr>
+                <w:rFonts w:ascii="Cambria Math" w:eastAsiaTheme="minorEastAsia" w:hAnsi="Cambria Math"/>
+                <w:i/>
+              </w:rPr>
+            </m:ctrlPr>
+          </m:funcPr>
+          <m:fName>
+            <m:r>
+              <m:rPr>
+                <m:sty m:val="p"/>
+              </m:rPr>
+              <w:rPr>
+                <w:rFonts w:ascii="Cambria Math" w:eastAsiaTheme="minorEastAsia" w:hAnsi="Cambria Math"/>
+              </w:rPr>
+              <m:t>cos</m:t>
+            </m:r>
+          </m:fName>
+          <m:e>
+            <m:d>
+              <m:dPr>
+                <m:ctrlPr>
+                  <w:rPr>
+                    <w:rFonts w:ascii="Cambria Math" w:eastAsiaTheme="minorEastAsia" w:hAnsi="Cambria Math"/>
+                    <w:i/>
+                  </w:rPr>
+                </m:ctrlPr>
+              </m:dPr>
+              <m:e>
+                <m:r>
+                  <w:rPr>
+                    <w:rFonts w:ascii="Cambria Math" w:eastAsiaTheme="minorEastAsia" w:hAnsi="Cambria Math"/>
+                  </w:rPr>
+                  <m:t>2π*60t-75.14°</m:t>
+                </m:r>
+              </m:e>
+            </m:d>
+            <m:r>
+              <w:rPr>
+                <w:rFonts w:ascii="Cambria Math" w:eastAsiaTheme="minorEastAsia" w:hAnsi="Cambria Math"/>
+              </w:rPr>
+              <m:t>=153,84</m:t>
+            </m:r>
+            <m:func>
+              <m:funcPr>
+                <m:ctrlPr>
+                  <w:rPr>
+                    <w:rFonts w:ascii="Cambria Math" w:eastAsiaTheme="minorEastAsia" w:hAnsi="Cambria Math"/>
+                    <w:i/>
+                  </w:rPr>
+                </m:ctrlPr>
+              </m:funcPr>
+              <m:fName>
+                <m:r>
+                  <m:rPr>
+                    <m:sty m:val="p"/>
+                  </m:rPr>
+                  <w:rPr>
+                    <w:rFonts w:ascii="Cambria Math" w:hAnsi="Cambria Math"/>
+                  </w:rPr>
+                  <m:t>sin</m:t>
+                </m:r>
+              </m:fName>
+              <m:e>
+                <m:r>
+                  <w:rPr>
+                    <w:rFonts w:ascii="Cambria Math" w:eastAsiaTheme="minorEastAsia" w:hAnsi="Cambria Math"/>
+                  </w:rPr>
+                  <m:t>(2π*60+14.86)</m:t>
+                </m:r>
+              </m:e>
+            </m:func>
+          </m:e>
+        </m:func>
+      </m:oMath>
+      <w:r>
+        <w:rPr>
+          <w:rFonts w:eastAsiaTheme="minorEastAsia"/>
+        </w:rPr>
+        <w:t xml:space="preserve"> =</w:t>
+      </w:r>
     </w:p>
     <w:p>
       <w:pPr>
@@ -1423,10 +1503,10 @@
           <w:noProof/>
         </w:rPr>
         <w:drawing>
-          <wp:inline distT="0" distB="0" distL="0" distR="0" wp14:anchorId="738E1B49" wp14:editId="0030FC54">
-            <wp:extent cx="5731510" cy="2922270"/>
-            <wp:effectExtent l="0" t="0" r="2540" b="0"/>
-            <wp:docPr id="4" name="Picture 4"/>
+          <wp:inline distT="0" distB="0" distL="0" distR="0" wp14:anchorId="3D113D1A" wp14:editId="5961DE2B">
+            <wp:extent cx="3439005" cy="2610214"/>
+            <wp:effectExtent l="0" t="0" r="9525" b="0"/>
+            <wp:docPr id="16" name="Picture 16"/>
             <wp:cNvGraphicFramePr>
               <a:graphicFrameLocks xmlns:a="http://schemas.openxmlformats.org/drawingml/2006/main" noChangeAspect="1"/>
             </wp:cNvGraphicFramePr>
@@ -1446,7 +1526,7 @@
                   <pic:spPr>
                     <a:xfrm>
                       <a:off x="0" y="0"/>
-                      <a:ext cx="5731510" cy="2922270"/>
+                      <a:ext cx="3439005" cy="2610214"/>
                     </a:xfrm>
                     <a:prstGeom prst="rect">
                       <a:avLst/>
@@ -1487,18 +1567,13 @@
       <w:r>
         <w:t xml:space="preserve"> phase and magnitude of 1st and 2nd harmonics</w:t>
       </w:r>
-    </w:p>
-    <w:p>
-      <w:r>
-        <w:t xml:space="preserve">Using the Fourier block we are able to </w:t>
-      </w:r>
-      <w:proofErr w:type="spellStart"/>
-      <w:r>
-        <w:t>fid</w:t>
-      </w:r>
-      <w:proofErr w:type="spellEnd"/>
-      <w:r>
-        <w:t xml:space="preserve"> the magnitude and phase of each of the harmonics. We see the value measured are quite similar to the calculated values. Also see the magnitude of the voltage harmonics decrease as the harmonics increase. </w:t>
+      <w:r>
+        <w:t xml:space="preserve"> of voltage</w:t>
+      </w:r>
+    </w:p>
+    <w:p>
+      <w:r>
+        <w:t xml:space="preserve">Using the Fourier block we are able to fid the magnitude and phase of each of the harmonics. We see the value measured are quite similar to the calculated values. Also see the magnitude of the voltage harmonics decrease as the harmonics increase. </w:t>
       </w:r>
     </w:p>
     <w:p/>
@@ -3846,19 +3921,11 @@
       </m:oMathPara>
     </w:p>
     <w:p>
-      <w:proofErr w:type="gramStart"/>
       <w:r>
         <w:rPr>
           <w:rFonts w:eastAsiaTheme="minorEastAsia"/>
         </w:rPr>
-        <w:t>Alternatively</w:t>
-      </w:r>
-      <w:proofErr w:type="gramEnd"/>
-      <w:r>
-        <w:rPr>
-          <w:rFonts w:eastAsiaTheme="minorEastAsia"/>
-        </w:rPr>
-        <w:t xml:space="preserve"> MATLAB also offers an RMS block which can calculate the RMS value for you.</w:t>
+        <w:t>Alternatively MATLAB also offers an RMS block which can calculate the RMS value for you.</w:t>
       </w:r>
       <m:oMath>
         <m:r>
@@ -3947,7 +4014,6 @@
         <w:keepNext/>
       </w:pPr>
       <w:r>
-        <w:lastRenderedPageBreak/>
         <w:drawing>
           <wp:inline distT="0" distB="0" distL="0" distR="0" wp14:anchorId="1E53B81E" wp14:editId="0CCB279A">
             <wp:extent cx="1438476" cy="800212"/>
@@ -4270,6 +4336,45 @@
         <w:t>As we can see the simulated value for PF closely matches the calculated value.</w:t>
       </w:r>
     </w:p>
+    <w:p>
+      <w:r>
+        <w:drawing>
+          <wp:inline distT="0" distB="0" distL="0" distR="0" wp14:anchorId="413AE407" wp14:editId="307EC9A8">
+            <wp:extent cx="4469642" cy="2568088"/>
+            <wp:effectExtent l="0" t="0" r="7620" b="3810"/>
+            <wp:docPr id="15" name="Picture 15"/>
+            <wp:cNvGraphicFramePr>
+              <a:graphicFrameLocks xmlns:a="http://schemas.openxmlformats.org/drawingml/2006/main" noChangeAspect="1"/>
+            </wp:cNvGraphicFramePr>
+            <a:graphic xmlns:a="http://schemas.openxmlformats.org/drawingml/2006/main">
+              <a:graphicData uri="http://schemas.openxmlformats.org/drawingml/2006/picture">
+                <pic:pic xmlns:pic="http://schemas.openxmlformats.org/drawingml/2006/picture">
+                  <pic:nvPicPr>
+                    <pic:cNvPr id="1" name=""/>
+                    <pic:cNvPicPr/>
+                  </pic:nvPicPr>
+                  <pic:blipFill>
+                    <a:blip r:embed="rId13"/>
+                    <a:stretch>
+                      <a:fillRect/>
+                    </a:stretch>
+                  </pic:blipFill>
+                  <pic:spPr>
+                    <a:xfrm>
+                      <a:off x="0" y="0"/>
+                      <a:ext cx="4481596" cy="2574957"/>
+                    </a:xfrm>
+                    <a:prstGeom prst="rect">
+                      <a:avLst/>
+                    </a:prstGeom>
+                  </pic:spPr>
+                </pic:pic>
+              </a:graphicData>
+            </a:graphic>
+          </wp:inline>
+        </w:drawing>
+      </w:r>
+    </w:p>
     <w:p/>
     <w:p/>
     <w:p/>
@@ -4278,17 +4383,1577 @@
     <w:p/>
     <w:p/>
     <w:p/>
+    <w:p>
+      <w:pPr>
+        <w:pStyle w:val="Heading2"/>
+      </w:pPr>
+      <w:r>
+        <w:t xml:space="preserve">Question 2 </w:t>
+      </w:r>
+    </w:p>
+    <w:p>
+      <w:pPr>
+        <w:pStyle w:val="ListParagraph"/>
+        <w:keepNext/>
+        <w:numPr>
+          <w:ilvl w:val="0"/>
+          <w:numId w:val="3"/>
+        </w:numPr>
+      </w:pPr>
+      <w:r>
+        <w:br/>
+      </w:r>
+      <w:r>
+        <w:drawing>
+          <wp:inline distT="0" distB="0" distL="0" distR="0" wp14:anchorId="3F096D8A" wp14:editId="07A36E20">
+            <wp:extent cx="5731510" cy="2778125"/>
+            <wp:effectExtent l="0" t="0" r="2540" b="3175"/>
+            <wp:docPr id="17" name="Picture 17"/>
+            <wp:cNvGraphicFramePr>
+              <a:graphicFrameLocks xmlns:a="http://schemas.openxmlformats.org/drawingml/2006/main" noChangeAspect="1"/>
+            </wp:cNvGraphicFramePr>
+            <a:graphic xmlns:a="http://schemas.openxmlformats.org/drawingml/2006/main">
+              <a:graphicData uri="http://schemas.openxmlformats.org/drawingml/2006/picture">
+                <pic:pic xmlns:pic="http://schemas.openxmlformats.org/drawingml/2006/picture">
+                  <pic:nvPicPr>
+                    <pic:cNvPr id="1" name=""/>
+                    <pic:cNvPicPr/>
+                  </pic:nvPicPr>
+                  <pic:blipFill>
+                    <a:blip r:embed="rId14"/>
+                    <a:stretch>
+                      <a:fillRect/>
+                    </a:stretch>
+                  </pic:blipFill>
+                  <pic:spPr>
+                    <a:xfrm>
+                      <a:off x="0" y="0"/>
+                      <a:ext cx="5731510" cy="2778125"/>
+                    </a:xfrm>
+                    <a:prstGeom prst="rect">
+                      <a:avLst/>
+                    </a:prstGeom>
+                  </pic:spPr>
+                </pic:pic>
+              </a:graphicData>
+            </a:graphic>
+          </wp:inline>
+        </w:drawing>
+      </w:r>
+    </w:p>
+    <w:p>
+      <w:pPr>
+        <w:pStyle w:val="Caption"/>
+        <w:keepNext/>
+      </w:pPr>
+      <w:r>
+        <w:t xml:space="preserve">Figure </w:t>
+      </w:r>
+      <w:r>
+        <w:fldChar w:fldCharType="begin"/>
+      </w:r>
+      <w:r>
+        <w:instrText xml:space="preserve"> SEQ Figure \* ARABIC </w:instrText>
+      </w:r>
+      <w:r>
+        <w:fldChar w:fldCharType="separate"/>
+      </w:r>
+      <w:r>
+        <w:rPr>
+          <w:noProof/>
+        </w:rPr>
+        <w:t>8</w:t>
+      </w:r>
+      <w:r>
+        <w:fldChar w:fldCharType="end"/>
+      </w:r>
+      <w:r>
+        <w:t xml:space="preserve"> Instantaneous voltage waveform</w:t>
+      </w:r>
+      <w:r>
+        <w:br/>
+      </w:r>
+      <w:r>
+        <w:drawing>
+          <wp:inline distT="0" distB="0" distL="0" distR="0" wp14:anchorId="19C5CAD8" wp14:editId="06ACA60A">
+            <wp:extent cx="5731510" cy="2778125"/>
+            <wp:effectExtent l="0" t="0" r="2540" b="3175"/>
+            <wp:docPr id="18" name="Picture 18"/>
+            <wp:cNvGraphicFramePr>
+              <a:graphicFrameLocks xmlns:a="http://schemas.openxmlformats.org/drawingml/2006/main" noChangeAspect="1"/>
+            </wp:cNvGraphicFramePr>
+            <a:graphic xmlns:a="http://schemas.openxmlformats.org/drawingml/2006/main">
+              <a:graphicData uri="http://schemas.openxmlformats.org/drawingml/2006/picture">
+                <pic:pic xmlns:pic="http://schemas.openxmlformats.org/drawingml/2006/picture">
+                  <pic:nvPicPr>
+                    <pic:cNvPr id="1" name=""/>
+                    <pic:cNvPicPr/>
+                  </pic:nvPicPr>
+                  <pic:blipFill>
+                    <a:blip r:embed="rId15"/>
+                    <a:stretch>
+                      <a:fillRect/>
+                    </a:stretch>
+                  </pic:blipFill>
+                  <pic:spPr>
+                    <a:xfrm>
+                      <a:off x="0" y="0"/>
+                      <a:ext cx="5731510" cy="2778125"/>
+                    </a:xfrm>
+                    <a:prstGeom prst="rect">
+                      <a:avLst/>
+                    </a:prstGeom>
+                  </pic:spPr>
+                </pic:pic>
+              </a:graphicData>
+            </a:graphic>
+          </wp:inline>
+        </w:drawing>
+      </w:r>
+    </w:p>
+    <w:p>
+      <w:pPr>
+        <w:pStyle w:val="Caption"/>
+      </w:pPr>
+      <w:r>
+        <w:t xml:space="preserve">Figure </w:t>
+      </w:r>
+      <w:r>
+        <w:fldChar w:fldCharType="begin"/>
+      </w:r>
+      <w:r>
+        <w:instrText xml:space="preserve"> SEQ Figure \* ARABIC </w:instrText>
+      </w:r>
+      <w:r>
+        <w:fldChar w:fldCharType="separate"/>
+      </w:r>
+      <w:r>
+        <w:rPr>
+          <w:noProof/>
+        </w:rPr>
+        <w:t>9</w:t>
+      </w:r>
+      <w:r>
+        <w:fldChar w:fldCharType="end"/>
+      </w:r>
+      <w:r>
+        <w:t xml:space="preserve"> Instantaneous current</w:t>
+      </w:r>
+    </w:p>
     <w:p/>
     <w:p>
       <w:pPr>
-        <w:pStyle w:val="Heading2"/>
+        <w:pStyle w:val="ListParagraph"/>
+        <w:keepNext/>
+        <w:numPr>
+          <w:ilvl w:val="0"/>
+          <w:numId w:val="3"/>
+        </w:numPr>
       </w:pPr>
       <w:r>
         <w:lastRenderedPageBreak/>
-        <w:t xml:space="preserve">Question 2 </w:t>
+        <w:br/>
+      </w:r>
+      <w:r>
+        <w:drawing>
+          <wp:inline distT="0" distB="0" distL="0" distR="0" wp14:anchorId="5D12CBB4" wp14:editId="351DB0E0">
+            <wp:extent cx="3448531" cy="1086002"/>
+            <wp:effectExtent l="0" t="0" r="0" b="0"/>
+            <wp:docPr id="19" name="Picture 19"/>
+            <wp:cNvGraphicFramePr>
+              <a:graphicFrameLocks xmlns:a="http://schemas.openxmlformats.org/drawingml/2006/main" noChangeAspect="1"/>
+            </wp:cNvGraphicFramePr>
+            <a:graphic xmlns:a="http://schemas.openxmlformats.org/drawingml/2006/main">
+              <a:graphicData uri="http://schemas.openxmlformats.org/drawingml/2006/picture">
+                <pic:pic xmlns:pic="http://schemas.openxmlformats.org/drawingml/2006/picture">
+                  <pic:nvPicPr>
+                    <pic:cNvPr id="1" name=""/>
+                    <pic:cNvPicPr/>
+                  </pic:nvPicPr>
+                  <pic:blipFill>
+                    <a:blip r:embed="rId16"/>
+                    <a:stretch>
+                      <a:fillRect/>
+                    </a:stretch>
+                  </pic:blipFill>
+                  <pic:spPr>
+                    <a:xfrm>
+                      <a:off x="0" y="0"/>
+                      <a:ext cx="3448531" cy="1086002"/>
+                    </a:xfrm>
+                    <a:prstGeom prst="rect">
+                      <a:avLst/>
+                    </a:prstGeom>
+                  </pic:spPr>
+                </pic:pic>
+              </a:graphicData>
+            </a:graphic>
+          </wp:inline>
+        </w:drawing>
+      </w:r>
+    </w:p>
+    <w:p>
+      <w:pPr>
+        <w:pStyle w:val="Caption"/>
+        <w:keepNext/>
+      </w:pPr>
+      <w:r>
+        <w:t xml:space="preserve">Figure </w:t>
+      </w:r>
+      <w:r>
+        <w:fldChar w:fldCharType="begin"/>
+      </w:r>
+      <w:r>
+        <w:instrText xml:space="preserve"> SEQ Figure \* ARABIC </w:instrText>
+      </w:r>
+      <w:r>
+        <w:fldChar w:fldCharType="separate"/>
+      </w:r>
+      <w:r>
+        <w:rPr>
+          <w:noProof/>
+        </w:rPr>
+        <w:t>10</w:t>
+      </w:r>
+      <w:r>
+        <w:fldChar w:fldCharType="end"/>
+      </w:r>
+      <w:r>
+        <w:t xml:space="preserve"> RMS current calculated using and RMS block</w:t>
+      </w:r>
+      <w:r>
+        <w:br/>
+      </w:r>
+      <w:r>
+        <w:br/>
+      </w:r>
+      <w:r>
+        <w:drawing>
+          <wp:inline distT="0" distB="0" distL="0" distR="0" wp14:anchorId="058C707E" wp14:editId="77C4398F">
+            <wp:extent cx="3219899" cy="1047896"/>
+            <wp:effectExtent l="0" t="0" r="0" b="0"/>
+            <wp:docPr id="20" name="Picture 20"/>
+            <wp:cNvGraphicFramePr>
+              <a:graphicFrameLocks xmlns:a="http://schemas.openxmlformats.org/drawingml/2006/main" noChangeAspect="1"/>
+            </wp:cNvGraphicFramePr>
+            <a:graphic xmlns:a="http://schemas.openxmlformats.org/drawingml/2006/main">
+              <a:graphicData uri="http://schemas.openxmlformats.org/drawingml/2006/picture">
+                <pic:pic xmlns:pic="http://schemas.openxmlformats.org/drawingml/2006/picture">
+                  <pic:nvPicPr>
+                    <pic:cNvPr id="1" name=""/>
+                    <pic:cNvPicPr/>
+                  </pic:nvPicPr>
+                  <pic:blipFill>
+                    <a:blip r:embed="rId17"/>
+                    <a:stretch>
+                      <a:fillRect/>
+                    </a:stretch>
+                  </pic:blipFill>
+                  <pic:spPr>
+                    <a:xfrm>
+                      <a:off x="0" y="0"/>
+                      <a:ext cx="3219899" cy="1047896"/>
+                    </a:xfrm>
+                    <a:prstGeom prst="rect">
+                      <a:avLst/>
+                    </a:prstGeom>
+                  </pic:spPr>
+                </pic:pic>
+              </a:graphicData>
+            </a:graphic>
+          </wp:inline>
+        </w:drawing>
+      </w:r>
+    </w:p>
+    <w:p>
+      <w:pPr>
+        <w:pStyle w:val="Caption"/>
+      </w:pPr>
+      <w:r>
+        <w:t xml:space="preserve">Figure </w:t>
+      </w:r>
+      <w:r>
+        <w:fldChar w:fldCharType="begin"/>
+      </w:r>
+      <w:r>
+        <w:instrText xml:space="preserve"> SEQ Figure \* ARABIC </w:instrText>
+      </w:r>
+      <w:r>
+        <w:fldChar w:fldCharType="separate"/>
+      </w:r>
+      <w:r>
+        <w:rPr>
+          <w:noProof/>
+        </w:rPr>
+        <w:t>11</w:t>
+      </w:r>
+      <w:r>
+        <w:fldChar w:fldCharType="end"/>
+      </w:r>
+      <w:r>
+        <w:t xml:space="preserve"> RMS voltage found using RMS block</w:t>
+      </w:r>
+      <w:r>
+        <w:br/>
+      </w:r>
+      <w:r>
+        <w:br/>
+      </w:r>
+    </w:p>
+    <w:p>
+      <w:pPr>
+        <w:pStyle w:val="ListParagraph"/>
+        <w:keepNext/>
+        <w:numPr>
+          <w:ilvl w:val="0"/>
+          <w:numId w:val="3"/>
+        </w:numPr>
+      </w:pPr>
+      <w:r>
+        <w:br/>
+      </w:r>
+      <w:r>
+        <w:drawing>
+          <wp:inline distT="0" distB="0" distL="0" distR="0" wp14:anchorId="127596AB" wp14:editId="240BC5B6">
+            <wp:extent cx="5731510" cy="2778125"/>
+            <wp:effectExtent l="0" t="0" r="2540" b="3175"/>
+            <wp:docPr id="22" name="Picture 22"/>
+            <wp:cNvGraphicFramePr>
+              <a:graphicFrameLocks xmlns:a="http://schemas.openxmlformats.org/drawingml/2006/main" noChangeAspect="1"/>
+            </wp:cNvGraphicFramePr>
+            <a:graphic xmlns:a="http://schemas.openxmlformats.org/drawingml/2006/main">
+              <a:graphicData uri="http://schemas.openxmlformats.org/drawingml/2006/picture">
+                <pic:pic xmlns:pic="http://schemas.openxmlformats.org/drawingml/2006/picture">
+                  <pic:nvPicPr>
+                    <pic:cNvPr id="1" name=""/>
+                    <pic:cNvPicPr/>
+                  </pic:nvPicPr>
+                  <pic:blipFill>
+                    <a:blip r:embed="rId18"/>
+                    <a:stretch>
+                      <a:fillRect/>
+                    </a:stretch>
+                  </pic:blipFill>
+                  <pic:spPr>
+                    <a:xfrm>
+                      <a:off x="0" y="0"/>
+                      <a:ext cx="5731510" cy="2778125"/>
+                    </a:xfrm>
+                    <a:prstGeom prst="rect">
+                      <a:avLst/>
+                    </a:prstGeom>
+                  </pic:spPr>
+                </pic:pic>
+              </a:graphicData>
+            </a:graphic>
+          </wp:inline>
+        </w:drawing>
+      </w:r>
+    </w:p>
+    <w:p>
+      <w:pPr>
+        <w:pStyle w:val="Caption"/>
+      </w:pPr>
+      <w:r>
+        <w:t xml:space="preserve">Figure </w:t>
+      </w:r>
+      <w:r>
+        <w:fldChar w:fldCharType="begin"/>
+      </w:r>
+      <w:r>
+        <w:instrText xml:space="preserve"> SEQ Figure \* ARABIC </w:instrText>
+      </w:r>
+      <w:r>
+        <w:fldChar w:fldCharType="separate"/>
+      </w:r>
+      <w:r>
+        <w:rPr>
+          <w:noProof/>
+        </w:rPr>
+        <w:t>12</w:t>
+      </w:r>
+      <w:r>
+        <w:fldChar w:fldCharType="end"/>
+      </w:r>
+      <w:r>
+        <w:t xml:space="preserve"> Instantaneous power waveform</w:t>
+      </w:r>
+    </w:p>
+    <w:p>
+      <w:pPr>
+        <w:pStyle w:val="ListParagraph"/>
+        <w:numPr>
+          <w:ilvl w:val="0"/>
+          <w:numId w:val="3"/>
+        </w:numPr>
+      </w:pPr>
+    </w:p>
+    <w:p>
+      <w:pPr>
+        <w:rPr>
+          <w:rFonts w:eastAsiaTheme="minorEastAsia"/>
+        </w:rPr>
+      </w:pPr>
+      <m:oMathPara>
+        <m:oMath>
+          <m:r>
+            <w:rPr>
+              <w:rFonts w:ascii="Cambria Math" w:hAnsi="Cambria Math"/>
+            </w:rPr>
+            <m:t xml:space="preserve">P= </m:t>
+          </m:r>
+          <m:sSub>
+            <m:sSubPr>
+              <m:ctrlPr>
+                <w:rPr>
+                  <w:rFonts w:ascii="Cambria Math" w:hAnsi="Cambria Math"/>
+                  <w:i/>
+                </w:rPr>
+              </m:ctrlPr>
+            </m:sSubPr>
+            <m:e>
+              <m:r>
+                <w:rPr>
+                  <w:rFonts w:ascii="Cambria Math" w:hAnsi="Cambria Math"/>
+                </w:rPr>
+                <m:t>P</m:t>
+              </m:r>
+            </m:e>
+            <m:sub>
+              <m:r>
+                <w:rPr>
+                  <w:rFonts w:ascii="Cambria Math" w:hAnsi="Cambria Math"/>
+                </w:rPr>
+                <m:t>DC</m:t>
+              </m:r>
+            </m:sub>
+          </m:sSub>
+          <m:r>
+            <w:rPr>
+              <w:rFonts w:ascii="Cambria Math" w:hAnsi="Cambria Math"/>
+            </w:rPr>
+            <m:t>+</m:t>
+          </m:r>
+          <m:sSub>
+            <m:sSubPr>
+              <m:ctrlPr>
+                <w:rPr>
+                  <w:rFonts w:ascii="Cambria Math" w:hAnsi="Cambria Math"/>
+                  <w:i/>
+                </w:rPr>
+              </m:ctrlPr>
+            </m:sSubPr>
+            <m:e>
+              <m:r>
+                <w:rPr>
+                  <w:rFonts w:ascii="Cambria Math" w:hAnsi="Cambria Math"/>
+                </w:rPr>
+                <m:t>P</m:t>
+              </m:r>
+            </m:e>
+            <m:sub>
+              <m:r>
+                <w:rPr>
+                  <w:rFonts w:ascii="Cambria Math" w:hAnsi="Cambria Math"/>
+                </w:rPr>
+                <m:t>1</m:t>
+              </m:r>
+            </m:sub>
+          </m:sSub>
+          <m:r>
+            <w:rPr>
+              <w:rFonts w:ascii="Cambria Math" w:hAnsi="Cambria Math"/>
+            </w:rPr>
+            <m:t>+</m:t>
+          </m:r>
+          <m:sSub>
+            <m:sSubPr>
+              <m:ctrlPr>
+                <w:rPr>
+                  <w:rFonts w:ascii="Cambria Math" w:hAnsi="Cambria Math"/>
+                  <w:i/>
+                </w:rPr>
+              </m:ctrlPr>
+            </m:sSubPr>
+            <m:e>
+              <m:r>
+                <w:rPr>
+                  <w:rFonts w:ascii="Cambria Math" w:hAnsi="Cambria Math"/>
+                </w:rPr>
+                <m:t>P</m:t>
+              </m:r>
+            </m:e>
+            <m:sub>
+              <m:r>
+                <w:rPr>
+                  <w:rFonts w:ascii="Cambria Math" w:hAnsi="Cambria Math"/>
+                </w:rPr>
+                <m:t>2</m:t>
+              </m:r>
+            </m:sub>
+          </m:sSub>
+        </m:oMath>
+      </m:oMathPara>
+    </w:p>
+    <w:p>
+      <w:pPr>
+        <w:rPr>
+          <w:rFonts w:eastAsiaTheme="minorEastAsia"/>
+        </w:rPr>
+      </w:pPr>
+      <m:oMathPara>
+        <m:oMath>
+          <m:sSub>
+            <m:sSubPr>
+              <m:ctrlPr>
+                <w:rPr>
+                  <w:rFonts w:ascii="Cambria Math" w:hAnsi="Cambria Math"/>
+                  <w:i/>
+                </w:rPr>
+              </m:ctrlPr>
+            </m:sSubPr>
+            <m:e>
+              <m:r>
+                <w:rPr>
+                  <w:rFonts w:ascii="Cambria Math" w:hAnsi="Cambria Math"/>
+                </w:rPr>
+                <m:t>P</m:t>
+              </m:r>
+            </m:e>
+            <m:sub>
+              <m:r>
+                <w:rPr>
+                  <w:rFonts w:ascii="Cambria Math" w:hAnsi="Cambria Math"/>
+                </w:rPr>
+                <m:t>DC</m:t>
+              </m:r>
+            </m:sub>
+          </m:sSub>
+          <m:r>
+            <w:rPr>
+              <w:rFonts w:ascii="Cambria Math" w:hAnsi="Cambria Math"/>
+            </w:rPr>
+            <m:t xml:space="preserve">=0 </m:t>
+          </m:r>
+          <m:r>
+            <w:rPr>
+              <w:rFonts w:ascii="Cambria Math" w:hAnsi="Cambria Math"/>
+            </w:rPr>
+            <w:br/>
+          </m:r>
+        </m:oMath>
+        <m:oMath>
+          <m:sSub>
+            <m:sSubPr>
+              <m:ctrlPr>
+                <w:rPr>
+                  <w:rFonts w:ascii="Cambria Math" w:hAnsi="Cambria Math"/>
+                  <w:i/>
+                </w:rPr>
+              </m:ctrlPr>
+            </m:sSubPr>
+            <m:e>
+              <m:r>
+                <w:rPr>
+                  <w:rFonts w:ascii="Cambria Math" w:hAnsi="Cambria Math"/>
+                </w:rPr>
+                <m:t>P</m:t>
+              </m:r>
+            </m:e>
+            <m:sub>
+              <m:r>
+                <w:rPr>
+                  <w:rFonts w:ascii="Cambria Math" w:hAnsi="Cambria Math"/>
+                </w:rPr>
+                <m:t>1</m:t>
+              </m:r>
+            </m:sub>
+          </m:sSub>
+          <m:r>
+            <w:rPr>
+              <w:rFonts w:ascii="Cambria Math" w:hAnsi="Cambria Math"/>
+            </w:rPr>
+            <m:t xml:space="preserve">= </m:t>
+          </m:r>
+          <m:f>
+            <m:fPr>
+              <m:ctrlPr>
+                <w:rPr>
+                  <w:rFonts w:ascii="Cambria Math" w:hAnsi="Cambria Math"/>
+                  <w:i/>
+                </w:rPr>
+              </m:ctrlPr>
+            </m:fPr>
+            <m:num>
+              <m:r>
+                <w:rPr>
+                  <w:rFonts w:ascii="Cambria Math" w:hAnsi="Cambria Math"/>
+                </w:rPr>
+                <m:t>170 ×10</m:t>
+              </m:r>
+            </m:num>
+            <m:den>
+              <m:r>
+                <w:rPr>
+                  <w:rFonts w:ascii="Cambria Math" w:hAnsi="Cambria Math"/>
+                </w:rPr>
+                <m:t>2</m:t>
+              </m:r>
+            </m:den>
+          </m:f>
+          <m:func>
+            <m:funcPr>
+              <m:ctrlPr>
+                <w:rPr>
+                  <w:rFonts w:ascii="Cambria Math" w:eastAsiaTheme="minorEastAsia" w:hAnsi="Cambria Math"/>
+                  <w:i/>
+                </w:rPr>
+              </m:ctrlPr>
+            </m:funcPr>
+            <m:fName>
+              <m:r>
+                <m:rPr>
+                  <m:sty m:val="p"/>
+                </m:rPr>
+                <w:rPr>
+                  <w:rFonts w:ascii="Cambria Math" w:hAnsi="Cambria Math"/>
+                </w:rPr>
+                <m:t>cos</m:t>
+              </m:r>
+            </m:fName>
+            <m:e>
+              <m:d>
+                <m:dPr>
+                  <m:ctrlPr>
+                    <w:rPr>
+                      <w:rFonts w:ascii="Cambria Math" w:eastAsiaTheme="minorEastAsia" w:hAnsi="Cambria Math"/>
+                      <w:i/>
+                    </w:rPr>
+                  </m:ctrlPr>
+                </m:dPr>
+                <m:e>
+                  <m:r>
+                    <w:rPr>
+                      <w:rFonts w:ascii="Cambria Math" w:eastAsiaTheme="minorEastAsia" w:hAnsi="Cambria Math"/>
+                    </w:rPr>
+                    <m:t>30°</m:t>
+                  </m:r>
+                </m:e>
+              </m:d>
+            </m:e>
+          </m:func>
+          <m:r>
+            <w:rPr>
+              <w:rFonts w:ascii="Cambria Math" w:eastAsiaTheme="minorEastAsia" w:hAnsi="Cambria Math"/>
+            </w:rPr>
+            <m:t>=736.1W</m:t>
+          </m:r>
+          <m:r>
+            <w:rPr>
+              <w:rFonts w:ascii="Cambria Math" w:eastAsiaTheme="minorEastAsia" w:hAnsi="Cambria Math"/>
+            </w:rPr>
+            <w:br/>
+          </m:r>
+        </m:oMath>
+        <m:oMath>
+          <m:sSub>
+            <m:sSubPr>
+              <m:ctrlPr>
+                <w:rPr>
+                  <w:rFonts w:ascii="Cambria Math" w:hAnsi="Cambria Math"/>
+                  <w:i/>
+                </w:rPr>
+              </m:ctrlPr>
+            </m:sSubPr>
+            <m:e>
+              <m:r>
+                <w:rPr>
+                  <w:rFonts w:ascii="Cambria Math" w:hAnsi="Cambria Math"/>
+                </w:rPr>
+                <m:t>P</m:t>
+              </m:r>
+            </m:e>
+            <m:sub>
+              <m:r>
+                <w:rPr>
+                  <w:rFonts w:ascii="Cambria Math" w:hAnsi="Cambria Math"/>
+                </w:rPr>
+                <m:t>2</m:t>
+              </m:r>
+            </m:sub>
+          </m:sSub>
+          <m:r>
+            <w:rPr>
+              <w:rFonts w:ascii="Cambria Math" w:hAnsi="Cambria Math"/>
+            </w:rPr>
+            <m:t xml:space="preserve">= </m:t>
+          </m:r>
+          <m:f>
+            <m:fPr>
+              <m:ctrlPr>
+                <w:rPr>
+                  <w:rFonts w:ascii="Cambria Math" w:hAnsi="Cambria Math"/>
+                  <w:i/>
+                </w:rPr>
+              </m:ctrlPr>
+            </m:fPr>
+            <m:num>
+              <m:r>
+                <w:rPr>
+                  <w:rFonts w:ascii="Cambria Math" w:hAnsi="Cambria Math"/>
+                </w:rPr>
+                <m:t>0 ×</m:t>
+              </m:r>
+              <m:r>
+                <w:rPr>
+                  <w:rFonts w:ascii="Cambria Math" w:hAnsi="Cambria Math"/>
+                </w:rPr>
+                <m:t>6</m:t>
+              </m:r>
+            </m:num>
+            <m:den>
+              <m:r>
+                <w:rPr>
+                  <w:rFonts w:ascii="Cambria Math" w:hAnsi="Cambria Math"/>
+                </w:rPr>
+                <m:t>2</m:t>
+              </m:r>
+            </m:den>
+          </m:f>
+          <m:func>
+            <m:funcPr>
+              <m:ctrlPr>
+                <w:rPr>
+                  <w:rFonts w:ascii="Cambria Math" w:eastAsiaTheme="minorEastAsia" w:hAnsi="Cambria Math"/>
+                  <w:i/>
+                </w:rPr>
+              </m:ctrlPr>
+            </m:funcPr>
+            <m:fName>
+              <m:r>
+                <m:rPr>
+                  <m:sty m:val="p"/>
+                </m:rPr>
+                <w:rPr>
+                  <w:rFonts w:ascii="Cambria Math" w:hAnsi="Cambria Math"/>
+                </w:rPr>
+                <m:t>cos</m:t>
+              </m:r>
+            </m:fName>
+            <m:e>
+              <m:d>
+                <m:dPr>
+                  <m:ctrlPr>
+                    <w:rPr>
+                      <w:rFonts w:ascii="Cambria Math" w:eastAsiaTheme="minorEastAsia" w:hAnsi="Cambria Math"/>
+                      <w:i/>
+                    </w:rPr>
+                  </m:ctrlPr>
+                </m:dPr>
+                <m:e>
+                  <m:r>
+                    <w:rPr>
+                      <w:rFonts w:ascii="Cambria Math" w:eastAsiaTheme="minorEastAsia" w:hAnsi="Cambria Math"/>
+                    </w:rPr>
+                    <m:t>45</m:t>
+                  </m:r>
+                  <m:r>
+                    <w:rPr>
+                      <w:rFonts w:ascii="Cambria Math" w:eastAsiaTheme="minorEastAsia" w:hAnsi="Cambria Math"/>
+                    </w:rPr>
+                    <m:t>°</m:t>
+                  </m:r>
+                </m:e>
+              </m:d>
+            </m:e>
+          </m:func>
+          <m:r>
+            <w:rPr>
+              <w:rFonts w:ascii="Cambria Math" w:eastAsiaTheme="minorEastAsia" w:hAnsi="Cambria Math"/>
+            </w:rPr>
+            <m:t>=</m:t>
+          </m:r>
+          <m:r>
+            <w:rPr>
+              <w:rFonts w:ascii="Cambria Math" w:eastAsiaTheme="minorEastAsia" w:hAnsi="Cambria Math"/>
+            </w:rPr>
+            <m:t>0</m:t>
+          </m:r>
+          <m:r>
+            <w:rPr>
+              <w:rFonts w:ascii="Cambria Math" w:eastAsiaTheme="minorEastAsia" w:hAnsi="Cambria Math"/>
+            </w:rPr>
+            <m:t>W</m:t>
+          </m:r>
+          <m:r>
+            <w:rPr>
+              <w:rFonts w:ascii="Cambria Math" w:eastAsiaTheme="minorEastAsia" w:hAnsi="Cambria Math"/>
+            </w:rPr>
+            <w:br/>
+          </m:r>
+        </m:oMath>
+        <m:oMath>
+          <m:sSub>
+            <m:sSubPr>
+              <m:ctrlPr>
+                <w:rPr>
+                  <w:rFonts w:ascii="Cambria Math" w:hAnsi="Cambria Math"/>
+                  <w:i/>
+                </w:rPr>
+              </m:ctrlPr>
+            </m:sSubPr>
+            <m:e>
+              <m:r>
+                <w:rPr>
+                  <w:rFonts w:ascii="Cambria Math" w:hAnsi="Cambria Math"/>
+                </w:rPr>
+                <m:t>P</m:t>
+              </m:r>
+            </m:e>
+            <m:sub>
+              <m:r>
+                <w:rPr>
+                  <w:rFonts w:ascii="Cambria Math" w:hAnsi="Cambria Math"/>
+                </w:rPr>
+                <m:t>3</m:t>
+              </m:r>
+            </m:sub>
+          </m:sSub>
+          <m:r>
+            <w:rPr>
+              <w:rFonts w:ascii="Cambria Math" w:hAnsi="Cambria Math"/>
+            </w:rPr>
+            <m:t xml:space="preserve">= </m:t>
+          </m:r>
+          <m:f>
+            <m:fPr>
+              <m:ctrlPr>
+                <w:rPr>
+                  <w:rFonts w:ascii="Cambria Math" w:hAnsi="Cambria Math"/>
+                  <w:i/>
+                </w:rPr>
+              </m:ctrlPr>
+            </m:fPr>
+            <m:num>
+              <m:r>
+                <w:rPr>
+                  <w:rFonts w:ascii="Cambria Math" w:hAnsi="Cambria Math"/>
+                </w:rPr>
+                <m:t>0 ×</m:t>
+              </m:r>
+              <m:r>
+                <w:rPr>
+                  <w:rFonts w:ascii="Cambria Math" w:hAnsi="Cambria Math"/>
+                </w:rPr>
+                <m:t>3</m:t>
+              </m:r>
+            </m:num>
+            <m:den>
+              <m:r>
+                <w:rPr>
+                  <w:rFonts w:ascii="Cambria Math" w:hAnsi="Cambria Math"/>
+                </w:rPr>
+                <m:t>2</m:t>
+              </m:r>
+            </m:den>
+          </m:f>
+          <m:func>
+            <m:funcPr>
+              <m:ctrlPr>
+                <w:rPr>
+                  <w:rFonts w:ascii="Cambria Math" w:eastAsiaTheme="minorEastAsia" w:hAnsi="Cambria Math"/>
+                  <w:i/>
+                </w:rPr>
+              </m:ctrlPr>
+            </m:funcPr>
+            <m:fName>
+              <m:r>
+                <m:rPr>
+                  <m:sty m:val="p"/>
+                </m:rPr>
+                <w:rPr>
+                  <w:rFonts w:ascii="Cambria Math" w:hAnsi="Cambria Math"/>
+                </w:rPr>
+                <m:t>cos</m:t>
+              </m:r>
+            </m:fName>
+            <m:e>
+              <m:d>
+                <m:dPr>
+                  <m:ctrlPr>
+                    <w:rPr>
+                      <w:rFonts w:ascii="Cambria Math" w:eastAsiaTheme="minorEastAsia" w:hAnsi="Cambria Math"/>
+                      <w:i/>
+                    </w:rPr>
+                  </m:ctrlPr>
+                </m:dPr>
+                <m:e>
+                  <m:r>
+                    <w:rPr>
+                      <w:rFonts w:ascii="Cambria Math" w:eastAsiaTheme="minorEastAsia" w:hAnsi="Cambria Math"/>
+                    </w:rPr>
+                    <m:t>2</m:t>
+                  </m:r>
+                  <m:r>
+                    <w:rPr>
+                      <w:rFonts w:ascii="Cambria Math" w:eastAsiaTheme="minorEastAsia" w:hAnsi="Cambria Math"/>
+                    </w:rPr>
+                    <m:t>0°</m:t>
+                  </m:r>
+                </m:e>
+              </m:d>
+            </m:e>
+          </m:func>
+          <m:r>
+            <w:rPr>
+              <w:rFonts w:ascii="Cambria Math" w:eastAsiaTheme="minorEastAsia" w:hAnsi="Cambria Math"/>
+            </w:rPr>
+            <m:t>=</m:t>
+          </m:r>
+          <m:r>
+            <w:rPr>
+              <w:rFonts w:ascii="Cambria Math" w:eastAsiaTheme="minorEastAsia" w:hAnsi="Cambria Math"/>
+            </w:rPr>
+            <m:t>0</m:t>
+          </m:r>
+          <m:r>
+            <w:rPr>
+              <w:rFonts w:ascii="Cambria Math" w:eastAsiaTheme="minorEastAsia" w:hAnsi="Cambria Math"/>
+            </w:rPr>
+            <m:t>W</m:t>
+          </m:r>
+        </m:oMath>
+      </m:oMathPara>
+    </w:p>
+    <w:p>
+      <w:pPr>
+        <w:keepNext/>
+      </w:pPr>
+      <m:oMathPara>
+        <m:oMath>
+          <m:sSub>
+            <m:sSubPr>
+              <m:ctrlPr>
+                <w:rPr>
+                  <w:rFonts w:ascii="Cambria Math" w:eastAsiaTheme="minorEastAsia" w:hAnsi="Cambria Math"/>
+                  <w:i/>
+                </w:rPr>
+              </m:ctrlPr>
+            </m:sSubPr>
+            <m:e>
+              <m:r>
+                <w:rPr>
+                  <w:rFonts w:ascii="Cambria Math" w:eastAsiaTheme="minorEastAsia" w:hAnsi="Cambria Math"/>
+                </w:rPr>
+                <m:t>P</m:t>
+              </m:r>
+            </m:e>
+            <m:sub>
+              <m:r>
+                <w:rPr>
+                  <w:rFonts w:ascii="Cambria Math" w:eastAsiaTheme="minorEastAsia" w:hAnsi="Cambria Math"/>
+                </w:rPr>
+                <m:t>avg</m:t>
+              </m:r>
+            </m:sub>
+          </m:sSub>
+          <m:r>
+            <w:rPr>
+              <w:rFonts w:ascii="Cambria Math" w:eastAsiaTheme="minorEastAsia" w:hAnsi="Cambria Math"/>
+            </w:rPr>
+            <m:t>=736.1W</m:t>
+          </m:r>
+          <m:r>
+            <w:rPr>
+              <w:rFonts w:eastAsiaTheme="minorEastAsia"/>
+            </w:rPr>
+            <w:br/>
+          </m:r>
+          <m:r>
+            <w:rPr>
+              <w:rFonts w:eastAsiaTheme="minorEastAsia"/>
+            </w:rPr>
+            <w:br/>
+          </m:r>
+        </m:oMath>
+      </m:oMathPara>
+      <w:r>
+        <w:rPr>
+          <w:rFonts w:eastAsiaTheme="minorEastAsia"/>
+        </w:rPr>
+        <w:drawing>
+          <wp:inline distT="0" distB="0" distL="0" distR="0" wp14:anchorId="38E023AD" wp14:editId="09C5857C">
+            <wp:extent cx="3743847" cy="2619741"/>
+            <wp:effectExtent l="0" t="0" r="0" b="9525"/>
+            <wp:docPr id="23" name="Picture 23"/>
+            <wp:cNvGraphicFramePr>
+              <a:graphicFrameLocks xmlns:a="http://schemas.openxmlformats.org/drawingml/2006/main" noChangeAspect="1"/>
+            </wp:cNvGraphicFramePr>
+            <a:graphic xmlns:a="http://schemas.openxmlformats.org/drawingml/2006/main">
+              <a:graphicData uri="http://schemas.openxmlformats.org/drawingml/2006/picture">
+                <pic:pic xmlns:pic="http://schemas.openxmlformats.org/drawingml/2006/picture">
+                  <pic:nvPicPr>
+                    <pic:cNvPr id="1" name=""/>
+                    <pic:cNvPicPr/>
+                  </pic:nvPicPr>
+                  <pic:blipFill>
+                    <a:blip r:embed="rId19"/>
+                    <a:stretch>
+                      <a:fillRect/>
+                    </a:stretch>
+                  </pic:blipFill>
+                  <pic:spPr>
+                    <a:xfrm>
+                      <a:off x="0" y="0"/>
+                      <a:ext cx="3743847" cy="2619741"/>
+                    </a:xfrm>
+                    <a:prstGeom prst="rect">
+                      <a:avLst/>
+                    </a:prstGeom>
+                  </pic:spPr>
+                </pic:pic>
+              </a:graphicData>
+            </a:graphic>
+          </wp:inline>
+        </w:drawing>
+      </w:r>
+    </w:p>
+    <w:p>
+      <w:pPr>
+        <w:pStyle w:val="Caption"/>
+      </w:pPr>
+      <w:r>
+        <w:t xml:space="preserve">Figure </w:t>
+      </w:r>
+      <w:r>
+        <w:fldChar w:fldCharType="begin"/>
+      </w:r>
+      <w:r>
+        <w:instrText xml:space="preserve"> SEQ Figure \* ARABIC </w:instrText>
+      </w:r>
+      <w:r>
+        <w:fldChar w:fldCharType="separate"/>
+      </w:r>
+      <w:r>
+        <w:rPr>
+          <w:noProof/>
+        </w:rPr>
+        <w:t>13</w:t>
+      </w:r>
+      <w:r>
+        <w:fldChar w:fldCharType="end"/>
+      </w:r>
+      <w:r>
+        <w:t xml:space="preserve"> calculation of average power in simulation</w:t>
+      </w:r>
+    </w:p>
+    <w:p>
+      <w:r>
+        <w:t>We can see that the calculated value agree with the value form simulation.</w:t>
+      </w:r>
+    </w:p>
+    <w:p>
+      <w:pPr>
+        <w:pStyle w:val="ListParagraph"/>
+        <w:keepNext/>
+        <w:numPr>
+          <w:ilvl w:val="0"/>
+          <w:numId w:val="3"/>
+        </w:numPr>
+      </w:pPr>
+      <w:r>
+        <w:br/>
+      </w:r>
+      <w:r>
+        <w:drawing>
+          <wp:inline distT="0" distB="0" distL="0" distR="0" wp14:anchorId="2C591E67" wp14:editId="71F013FB">
+            <wp:extent cx="2076740" cy="752580"/>
+            <wp:effectExtent l="0" t="0" r="0" b="9525"/>
+            <wp:docPr id="24" name="Picture 24"/>
+            <wp:cNvGraphicFramePr>
+              <a:graphicFrameLocks xmlns:a="http://schemas.openxmlformats.org/drawingml/2006/main" noChangeAspect="1"/>
+            </wp:cNvGraphicFramePr>
+            <a:graphic xmlns:a="http://schemas.openxmlformats.org/drawingml/2006/main">
+              <a:graphicData uri="http://schemas.openxmlformats.org/drawingml/2006/picture">
+                <pic:pic xmlns:pic="http://schemas.openxmlformats.org/drawingml/2006/picture">
+                  <pic:nvPicPr>
+                    <pic:cNvPr id="1" name=""/>
+                    <pic:cNvPicPr/>
+                  </pic:nvPicPr>
+                  <pic:blipFill>
+                    <a:blip r:embed="rId20"/>
+                    <a:stretch>
+                      <a:fillRect/>
+                    </a:stretch>
+                  </pic:blipFill>
+                  <pic:spPr>
+                    <a:xfrm>
+                      <a:off x="0" y="0"/>
+                      <a:ext cx="2076740" cy="752580"/>
+                    </a:xfrm>
+                    <a:prstGeom prst="rect">
+                      <a:avLst/>
+                    </a:prstGeom>
+                  </pic:spPr>
+                </pic:pic>
+              </a:graphicData>
+            </a:graphic>
+          </wp:inline>
+        </w:drawing>
+      </w:r>
+    </w:p>
+    <w:p>
+      <w:pPr>
+        <w:pStyle w:val="Caption"/>
+      </w:pPr>
+      <w:r>
+        <w:t xml:space="preserve">Figure </w:t>
+      </w:r>
+      <w:r>
+        <w:fldChar w:fldCharType="begin"/>
+      </w:r>
+      <w:r>
+        <w:instrText xml:space="preserve"> SEQ Figure \* ARABIC </w:instrText>
+      </w:r>
+      <w:r>
+        <w:fldChar w:fldCharType="separate"/>
+      </w:r>
+      <w:r>
+        <w:rPr>
+          <w:noProof/>
+        </w:rPr>
+        <w:t>14</w:t>
+      </w:r>
+      <w:r>
+        <w:fldChar w:fldCharType="end"/>
+      </w:r>
+      <w:r>
+        <w:t xml:space="preserve"> the THD value found using the THD block in matlab</w:t>
+      </w:r>
+    </w:p>
+    <w:p>
+      <w:r>
+        <w:t xml:space="preserve">We can then calculate the DF from the THD value </w:t>
+      </w:r>
+    </w:p>
+    <w:p>
+      <w:pPr>
+        <w:rPr>
+          <w:rFonts w:eastAsiaTheme="minorEastAsia"/>
+        </w:rPr>
+      </w:pPr>
+      <m:oMathPara>
+        <m:oMath>
+          <m:r>
+            <w:rPr>
+              <w:rFonts w:ascii="Cambria Math" w:hAnsi="Cambria Math"/>
+            </w:rPr>
+            <m:t>DF=</m:t>
+          </m:r>
+          <m:f>
+            <m:fPr>
+              <m:ctrlPr>
+                <w:rPr>
+                  <w:rFonts w:ascii="Cambria Math" w:hAnsi="Cambria Math"/>
+                  <w:i/>
+                </w:rPr>
+              </m:ctrlPr>
+            </m:fPr>
+            <m:num>
+              <m:r>
+                <w:rPr>
+                  <w:rFonts w:ascii="Cambria Math" w:hAnsi="Cambria Math"/>
+                </w:rPr>
+                <m:t>1</m:t>
+              </m:r>
+            </m:num>
+            <m:den>
+              <m:rad>
+                <m:radPr>
+                  <m:degHide m:val="1"/>
+                  <m:ctrlPr>
+                    <w:rPr>
+                      <w:rFonts w:ascii="Cambria Math" w:hAnsi="Cambria Math"/>
+                      <w:i/>
+                    </w:rPr>
+                  </m:ctrlPr>
+                </m:radPr>
+                <m:deg/>
+                <m:e>
+                  <m:r>
+                    <w:rPr>
+                      <w:rFonts w:ascii="Cambria Math" w:hAnsi="Cambria Math"/>
+                    </w:rPr>
+                    <m:t>1+</m:t>
+                  </m:r>
+                  <m:sSup>
+                    <m:sSupPr>
+                      <m:ctrlPr>
+                        <w:rPr>
+                          <w:rFonts w:ascii="Cambria Math" w:hAnsi="Cambria Math"/>
+                          <w:i/>
+                        </w:rPr>
+                      </m:ctrlPr>
+                    </m:sSupPr>
+                    <m:e>
+                      <m:r>
+                        <w:rPr>
+                          <w:rFonts w:ascii="Cambria Math" w:hAnsi="Cambria Math"/>
+                        </w:rPr>
+                        <m:t>THD</m:t>
+                      </m:r>
+                    </m:e>
+                    <m:sup>
+                      <m:r>
+                        <w:rPr>
+                          <w:rFonts w:ascii="Cambria Math" w:hAnsi="Cambria Math"/>
+                        </w:rPr>
+                        <m:t>2</m:t>
+                      </m:r>
+                    </m:sup>
+                  </m:sSup>
+                </m:e>
+              </m:rad>
+            </m:den>
+          </m:f>
+        </m:oMath>
+      </m:oMathPara>
+    </w:p>
+    <w:p>
+      <w:pPr>
+        <w:rPr>
+          <w:rFonts w:eastAsiaTheme="minorEastAsia"/>
+        </w:rPr>
+      </w:pPr>
+      <w:r>
+        <w:rPr>
+          <w:rFonts w:eastAsiaTheme="minorEastAsia"/>
+        </w:rPr>
+        <w:t>The above equation was simulated in MATLAB as follows.</w:t>
+      </w:r>
+    </w:p>
+    <w:p>
+      <w:pPr>
+        <w:keepNext/>
+      </w:pPr>
+      <w:r>
+        <w:drawing>
+          <wp:inline distT="0" distB="0" distL="0" distR="0" wp14:anchorId="30690ABC" wp14:editId="478C36F9">
+            <wp:extent cx="5731510" cy="1517650"/>
+            <wp:effectExtent l="0" t="0" r="2540" b="6350"/>
+            <wp:docPr id="25" name="Picture 25"/>
+            <wp:cNvGraphicFramePr>
+              <a:graphicFrameLocks xmlns:a="http://schemas.openxmlformats.org/drawingml/2006/main" noChangeAspect="1"/>
+            </wp:cNvGraphicFramePr>
+            <a:graphic xmlns:a="http://schemas.openxmlformats.org/drawingml/2006/main">
+              <a:graphicData uri="http://schemas.openxmlformats.org/drawingml/2006/picture">
+                <pic:pic xmlns:pic="http://schemas.openxmlformats.org/drawingml/2006/picture">
+                  <pic:nvPicPr>
+                    <pic:cNvPr id="1" name=""/>
+                    <pic:cNvPicPr/>
+                  </pic:nvPicPr>
+                  <pic:blipFill>
+                    <a:blip r:embed="rId21"/>
+                    <a:stretch>
+                      <a:fillRect/>
+                    </a:stretch>
+                  </pic:blipFill>
+                  <pic:spPr>
+                    <a:xfrm>
+                      <a:off x="0" y="0"/>
+                      <a:ext cx="5731510" cy="1517650"/>
+                    </a:xfrm>
+                    <a:prstGeom prst="rect">
+                      <a:avLst/>
+                    </a:prstGeom>
+                  </pic:spPr>
+                </pic:pic>
+              </a:graphicData>
+            </a:graphic>
+          </wp:inline>
+        </w:drawing>
+      </w:r>
+    </w:p>
+    <w:p>
+      <w:pPr>
+        <w:pStyle w:val="Caption"/>
+      </w:pPr>
+      <w:r>
+        <w:t xml:space="preserve">Figure </w:t>
+      </w:r>
+      <w:r>
+        <w:fldChar w:fldCharType="begin"/>
+      </w:r>
+      <w:r>
+        <w:instrText xml:space="preserve"> SEQ Figure \* ARABIC </w:instrText>
+      </w:r>
+      <w:r>
+        <w:fldChar w:fldCharType="separate"/>
+      </w:r>
+      <w:r>
+        <w:rPr>
+          <w:noProof/>
+        </w:rPr>
+        <w:t>15</w:t>
+      </w:r>
+      <w:r>
+        <w:fldChar w:fldCharType="end"/>
+      </w:r>
+      <w:r>
+        <w:t xml:space="preserve"> DF value calculation in Simulink</w:t>
+      </w:r>
+    </w:p>
+    <w:p>
+      <w:r>
+        <w:t xml:space="preserve">Ideally, we would want our DF value to be equal to 1, and have a minimum reduction in our PF. For the same reason we would want the THD value ideally equal to 0. The </w:t>
+      </w:r>
+      <w:r>
+        <w:lastRenderedPageBreak/>
+        <w:t>measured values are not equal to the ideal values which is likely due to harmonics of the current load.</w:t>
       </w:r>
     </w:p>
     <w:p/>
+    <w:p>
+      <w:pPr>
+        <w:pStyle w:val="ListParagraph"/>
+        <w:numPr>
+          <w:ilvl w:val="0"/>
+          <w:numId w:val="3"/>
+        </w:numPr>
+      </w:pPr>
+      <w:r>
+        <w:br/>
+      </w:r>
+      <w:r>
+        <w:t>For</w:t>
+      </w:r>
+      <w:r>
+        <w:t xml:space="preserve"> a practical circuit </w:t>
+      </w:r>
+      <w:r>
+        <w:t xml:space="preserve">we </w:t>
+      </w:r>
+      <w:r>
+        <w:t xml:space="preserve">can </w:t>
+      </w:r>
+      <w:r>
+        <w:t xml:space="preserve">make </w:t>
+      </w:r>
+      <w:r>
+        <w:t>mention</w:t>
+      </w:r>
+      <w:r>
+        <w:t xml:space="preserve"> of </w:t>
+      </w:r>
+      <w:r>
+        <w:t xml:space="preserve"> two methods to remove unwanted harmonic (or in other words unwanted frequency components). </w:t>
+      </w:r>
+      <w:r>
+        <w:rPr>
+          <w:b/>
+          <w:bCs/>
+        </w:rPr>
+        <w:t>Method 1</w:t>
+      </w:r>
+      <w:r>
+        <w:t>: Passive filters made from resistors, inductors and capacitors can remove specific harmonic components. They are typically connected in parallel with the non-linear load. At our fundamental frequency</w:t>
+      </w:r>
+      <w:r>
+        <w:t>,</w:t>
+      </w:r>
+      <w:r>
+        <w:t xml:space="preserve"> the filter has high impedance and does not interfere with normal operation. However, at specific harmonic frequencies we wish to remove the filter has a very low impedance which essentially draws away the harmonic current to ground. </w:t>
+      </w:r>
+      <w:r>
+        <w:rPr>
+          <w:b/>
+          <w:bCs/>
+        </w:rPr>
+        <w:t>Method 2:</w:t>
+      </w:r>
+      <w:r>
+        <w:t xml:space="preserve"> Active Power Filters Active power filters are a type of power electronics device. This device can cancel out harmonic components in real time by injecting compensating currents. They measure the load current then use a controller to calculate the harmonic content, then they generate equal but opposite harmonic current to cancel out these components.</w:t>
+      </w:r>
+      <w:r>
+        <w:br/>
+      </w:r>
+      <w:r>
+        <w:br/>
+      </w:r>
+    </w:p>
+    <w:p>
+      <w:pPr>
+        <w:pStyle w:val="ListParagraph"/>
+        <w:numPr>
+          <w:ilvl w:val="0"/>
+          <w:numId w:val="3"/>
+        </w:numPr>
+      </w:pPr>
+      <w:r>
+        <w:t>I</w:t>
+      </w:r>
+      <w:r>
+        <w:t>n part (i) it is observed that you apply a sinusoidal voltage waveform across a nonlinear load, you develop a current through the loa</w:t>
+      </w:r>
+      <w:r>
+        <w:t>d</w:t>
+      </w:r>
+      <w:r>
+        <w:t xml:space="preserve"> whose waveform is non-sinusoidal. This sinusoidal waveform contains harmonics and can therefore be represented by a Fourier series. In (iv) we see when trying to determine the average power delivered to the load, that the only non-zero power term is at the frequency of the applied voltage. This means there is additional power contained in other harmonics that is not being absorbed by the load. Therefore, the harmonics lead to a distortion in the power factor which can be represented by the DF (distortion factor) which we calculated in (v).</w:t>
+      </w:r>
+      <w:r>
+        <w:br/>
+      </w:r>
+      <m:oMathPara>
+        <m:oMath>
+          <m:r>
+            <w:rPr>
+              <w:rFonts w:ascii="Cambria Math" w:hAnsi="Cambria Math"/>
+            </w:rPr>
+            <m:t xml:space="preserve">PF= </m:t>
+          </m:r>
+          <m:func>
+            <m:funcPr>
+              <m:ctrlPr>
+                <w:rPr>
+                  <w:rFonts w:ascii="Cambria Math" w:hAnsi="Cambria Math"/>
+                  <w:i/>
+                </w:rPr>
+              </m:ctrlPr>
+            </m:funcPr>
+            <m:fName>
+              <m:r>
+                <m:rPr>
+                  <m:sty m:val="p"/>
+                </m:rPr>
+                <w:rPr>
+                  <w:rFonts w:ascii="Cambria Math" w:hAnsi="Cambria Math"/>
+                </w:rPr>
+                <m:t>cos</m:t>
+              </m:r>
+            </m:fName>
+            <m:e>
+              <m:r>
+                <w:rPr>
+                  <w:rFonts w:ascii="Cambria Math" w:hAnsi="Cambria Math"/>
+                </w:rPr>
+                <m:t>(</m:t>
+              </m:r>
+              <m:sSub>
+                <m:sSubPr>
+                  <m:ctrlPr>
+                    <w:rPr>
+                      <w:rFonts w:ascii="Cambria Math" w:hAnsi="Cambria Math"/>
+                      <w:i/>
+                    </w:rPr>
+                  </m:ctrlPr>
+                </m:sSubPr>
+                <m:e>
+                  <m:r>
+                    <w:rPr>
+                      <w:rFonts w:ascii="Cambria Math" w:hAnsi="Cambria Math"/>
+                    </w:rPr>
+                    <m:t>θ</m:t>
+                  </m:r>
+                </m:e>
+                <m:sub>
+                  <m:r>
+                    <w:rPr>
+                      <w:rFonts w:ascii="Cambria Math" w:hAnsi="Cambria Math"/>
+                    </w:rPr>
+                    <m:t>1</m:t>
+                  </m:r>
+                </m:sub>
+              </m:sSub>
+              <m:r>
+                <w:rPr>
+                  <w:rFonts w:ascii="Cambria Math" w:hAnsi="Cambria Math"/>
+                </w:rPr>
+                <m:t>-</m:t>
+              </m:r>
+              <m:sSub>
+                <m:sSubPr>
+                  <m:ctrlPr>
+                    <w:rPr>
+                      <w:rFonts w:ascii="Cambria Math" w:hAnsi="Cambria Math"/>
+                      <w:i/>
+                    </w:rPr>
+                  </m:ctrlPr>
+                </m:sSubPr>
+                <m:e>
+                  <m:r>
+                    <w:rPr>
+                      <w:rFonts w:ascii="Cambria Math" w:hAnsi="Cambria Math"/>
+                    </w:rPr>
+                    <m:t>ϕ</m:t>
+                  </m:r>
+                </m:e>
+                <m:sub>
+                  <m:r>
+                    <w:rPr>
+                      <w:rFonts w:ascii="Cambria Math" w:hAnsi="Cambria Math"/>
+                    </w:rPr>
+                    <m:t>1</m:t>
+                  </m:r>
+                </m:sub>
+              </m:sSub>
+              <m:r>
+                <w:rPr>
+                  <w:rFonts w:ascii="Cambria Math" w:hAnsi="Cambria Math"/>
+                </w:rPr>
+                <m:t>)×DF</m:t>
+              </m:r>
+            </m:e>
+          </m:func>
+        </m:oMath>
+      </m:oMathPara>
+    </w:p>
+    <w:p>
+      <w:pPr>
+        <w:rPr>
+          <w:rFonts w:eastAsiaTheme="minorEastAsia"/>
+        </w:rPr>
+      </w:pPr>
+    </w:p>
+    <w:p>
+      <w:pPr>
+        <w:rPr>
+          <w:rFonts w:eastAsiaTheme="minorEastAsia"/>
+        </w:rPr>
+      </w:pPr>
+      <m:oMathPara>
+        <m:oMathParaPr>
+          <m:jc m:val="left"/>
+        </m:oMathParaPr>
+        <m:oMath>
+          <m:r>
+            <w:rPr>
+              <w:rFonts w:ascii="Cambria Math" w:eastAsiaTheme="minorEastAsia" w:hAnsi="Cambria Math"/>
+            </w:rPr>
+            <w:br/>
+          </m:r>
+        </m:oMath>
+      </m:oMathPara>
+      <w:r>
+        <w:rPr>
+          <w:rFonts w:eastAsiaTheme="minorEastAsia"/>
+        </w:rPr>
+        <w:t xml:space="preserve">vii.  </w:t>
+      </w:r>
+      <w:r>
+        <w:rPr>
+          <w:rFonts w:eastAsiaTheme="minorEastAsia"/>
+        </w:rPr>
+        <w:t>According to international standards such as the IEEE 519, the maximum allowable THD limit on voltage from the grid is 5%. Voltage VHD can be seen as how non-linear loads distort the grid volage. Increasing current THD can contribute to this voltage distortion, which negatively affect the grid by reducing its stability and power transfer quality. This can also negatively affect other devices connected to the grid, hence why the THD is limited. Therefore, it’s very important for loads connected to the grid to be managed as to not exceedingly increase the grid voltage THD</w:t>
+      </w:r>
+    </w:p>
+    <w:p>
+      <w:pPr>
+        <w:rPr>
+          <w:rFonts w:eastAsiaTheme="minorEastAsia"/>
+        </w:rPr>
+      </w:pPr>
+    </w:p>
     <w:sectPr>
       <w:pgSz w:w="11906" w:h="16838"/>
       <w:pgMar w:top="1440" w:right="1440" w:bottom="1440" w:left="1440" w:header="708" w:footer="708" w:gutter="0"/>
@@ -4388,6 +6053,95 @@
     </w:lvl>
   </w:abstractNum>
   <w:abstractNum w:abstractNumId="1" w15:restartNumberingAfterBreak="0">
+    <w:nsid w:val="48AE7B3E"/>
+    <w:multiLevelType w:val="hybridMultilevel"/>
+    <w:tmpl w:val="415A831C"/>
+    <w:lvl w:ilvl="0" w:tplc="BFC0AC0E">
+      <w:start w:val="1"/>
+      <w:numFmt w:val="lowerRoman"/>
+      <w:lvlText w:val="%1."/>
+      <w:lvlJc w:val="left"/>
+      <w:pPr>
+        <w:ind w:left="1080" w:hanging="720"/>
+      </w:pPr>
+      <w:rPr>
+        <w:rFonts w:hint="default"/>
+      </w:rPr>
+    </w:lvl>
+    <w:lvl w:ilvl="1" w:tplc="1C090019" w:tentative="1">
+      <w:start w:val="1"/>
+      <w:numFmt w:val="lowerLetter"/>
+      <w:lvlText w:val="%2."/>
+      <w:lvlJc w:val="left"/>
+      <w:pPr>
+        <w:ind w:left="1440" w:hanging="360"/>
+      </w:pPr>
+    </w:lvl>
+    <w:lvl w:ilvl="2" w:tplc="1C09001B" w:tentative="1">
+      <w:start w:val="1"/>
+      <w:numFmt w:val="lowerRoman"/>
+      <w:lvlText w:val="%3."/>
+      <w:lvlJc w:val="right"/>
+      <w:pPr>
+        <w:ind w:left="2160" w:hanging="180"/>
+      </w:pPr>
+    </w:lvl>
+    <w:lvl w:ilvl="3" w:tplc="1C09000F" w:tentative="1">
+      <w:start w:val="1"/>
+      <w:numFmt w:val="decimal"/>
+      <w:lvlText w:val="%4."/>
+      <w:lvlJc w:val="left"/>
+      <w:pPr>
+        <w:ind w:left="2880" w:hanging="360"/>
+      </w:pPr>
+    </w:lvl>
+    <w:lvl w:ilvl="4" w:tplc="1C090019" w:tentative="1">
+      <w:start w:val="1"/>
+      <w:numFmt w:val="lowerLetter"/>
+      <w:lvlText w:val="%5."/>
+      <w:lvlJc w:val="left"/>
+      <w:pPr>
+        <w:ind w:left="3600" w:hanging="360"/>
+      </w:pPr>
+    </w:lvl>
+    <w:lvl w:ilvl="5" w:tplc="1C09001B" w:tentative="1">
+      <w:start w:val="1"/>
+      <w:numFmt w:val="lowerRoman"/>
+      <w:lvlText w:val="%6."/>
+      <w:lvlJc w:val="right"/>
+      <w:pPr>
+        <w:ind w:left="4320" w:hanging="180"/>
+      </w:pPr>
+    </w:lvl>
+    <w:lvl w:ilvl="6" w:tplc="1C09000F" w:tentative="1">
+      <w:start w:val="1"/>
+      <w:numFmt w:val="decimal"/>
+      <w:lvlText w:val="%7."/>
+      <w:lvlJc w:val="left"/>
+      <w:pPr>
+        <w:ind w:left="5040" w:hanging="360"/>
+      </w:pPr>
+    </w:lvl>
+    <w:lvl w:ilvl="7" w:tplc="1C090019" w:tentative="1">
+      <w:start w:val="1"/>
+      <w:numFmt w:val="lowerLetter"/>
+      <w:lvlText w:val="%8."/>
+      <w:lvlJc w:val="left"/>
+      <w:pPr>
+        <w:ind w:left="5760" w:hanging="360"/>
+      </w:pPr>
+    </w:lvl>
+    <w:lvl w:ilvl="8" w:tplc="1C09001B" w:tentative="1">
+      <w:start w:val="1"/>
+      <w:numFmt w:val="lowerRoman"/>
+      <w:lvlText w:val="%9."/>
+      <w:lvlJc w:val="right"/>
+      <w:pPr>
+        <w:ind w:left="6480" w:hanging="180"/>
+      </w:pPr>
+    </w:lvl>
+  </w:abstractNum>
+  <w:abstractNum w:abstractNumId="2" w15:restartNumberingAfterBreak="0">
     <w:nsid w:val="66D54980"/>
     <w:multiLevelType w:val="hybridMultilevel"/>
     <w:tmpl w:val="933E5D5A"/>
@@ -4477,6 +6231,9 @@
     <w:abstractNumId w:val="0"/>
   </w:num>
   <w:num w:numId="2" w16cid:durableId="2111730518">
+    <w:abstractNumId w:val="2"/>
+  </w:num>
+  <w:num w:numId="3" w16cid:durableId="718625840">
     <w:abstractNumId w:val="1"/>
   </w:num>
 </w:numbering>
@@ -5084,7 +6841,6 @@
   <w:style w:type="character" w:default="1" w:styleId="DefaultParagraphFont">
     <w:name w:val="Default Paragraph Font"/>
     <w:uiPriority w:val="1"/>
-    <w:semiHidden/>
     <w:unhideWhenUsed/>
   </w:style>
   <w:style w:type="table" w:default="1" w:styleId="TableNormal">

</xml_diff>

<commit_message>
compLETED POWER PROJ B
</commit_message>
<xml_diff>
--- a/EEE3091/Power electronics project part b.docx
+++ b/EEE3091/Power electronics project part b.docx
@@ -5944,7 +5944,19 @@
         <w:rPr>
           <w:rFonts w:eastAsiaTheme="minorEastAsia"/>
         </w:rPr>
-        <w:t>According to international standards such as the IEEE 519, the maximum allowable THD limit on voltage from the grid is 5%. Voltage VHD can be seen as how non-linear loads distort the grid volage. Increasing current THD can contribute to this voltage distortion, which negatively affect the grid by reducing its stability and power transfer quality. This can also negatively affect other devices connected to the grid, hence why the THD is limited. Therefore, it’s very important for loads connected to the grid to be managed as to not exceedingly increase the grid voltage THD</w:t>
+        <w:t xml:space="preserve">According to international standards such as the IEEE 519, the maximum allowable THD limit on voltage from the grid is 5%. Voltage </w:t>
+      </w:r>
+      <w:r>
+        <w:rPr>
+          <w:rFonts w:eastAsiaTheme="minorEastAsia"/>
+        </w:rPr>
+        <w:t>T</w:t>
+      </w:r>
+      <w:r>
+        <w:rPr>
+          <w:rFonts w:eastAsiaTheme="minorEastAsia"/>
+        </w:rPr>
+        <w:t>HD can be seen as how non-linear loads distort the grid volage. Increasing current THD can contribute to this voltage distortion, which negatively affect the grid by reducing its stability and power transfer quality. This can also negatively affect other devices connected to the grid, hence why the THD is limited. Therefore, it’s very important for loads connected to the grid to be managed as to not exceedingly increase the grid voltage THD</w:t>
       </w:r>
     </w:p>
     <w:p>

</xml_diff>